<commit_message>
Modified text on DDSA vs aggregated-count ODE fitting
</commit_message>
<xml_diff>
--- a/DDSA_vs_ODE_count/ddsa_vs_ode_count.docx
+++ b/DDSA_vs_ODE_count/ddsa_vs_ode_count.docx
@@ -32,7 +32,7 @@
         <w:pStyle w:val="FirstParagraph"/>
       </w:pPr>
       <w:r>
-        <w:t xml:space="preserve">This notebook contrasts discrete dynamic survival analysis (DDSA) with the familiar workflow of fitting a deterministic compartmental ODE to aggregated daily counts under a Poisson or Negative-Binomial observation model (see the</w:t>
+        <w:t xml:space="preserve">This notebook contrasts discrete dynamic survival analysis (DDSA) with fitting a deterministic compartmental ODE to aggregated daily counts under a Poisson or Negative-Binomial observation model (see the</w:t>
       </w:r>
       <w:r>
         <w:t xml:space="preserve"> </w:t>
@@ -729,7 +729,7 @@
         <w:t xml:space="preserve"> </w:t>
       </w:r>
       <w:r>
-        <w:t xml:space="preserve">free because no reliable external estimate exists. Model 4 represents the common practice of anchoring the IP mean from prior literature — fixing</w:t>
+        <w:t xml:space="preserve">free because no reliable external estimate exists. Model 4 represents one approach of anchoring the IP mean from prior literature — fixing</w:t>
       </w:r>
       <w:r>
         <w:t xml:space="preserve"> </w:t>
@@ -4023,10 +4023,61 @@
         <w:t xml:space="preserve">0</w:t>
       </w:r>
       <w:r>
-        <w:rPr>
-          <w:rStyle w:val="NormalTok"/>
-        </w:rPr>
-        <w:t xml:space="preserve"> </w:t>
+        <w:br/>
+      </w:r>
+      <w:r>
+        <w:rPr>
+          <w:rStyle w:val="NormalTok"/>
+        </w:rPr>
+        <w:t xml:space="preserve">        </w:t>
+      </w:r>
+      <w:r>
+        <w:rPr>
+          <w:rStyle w:val="ControlFlowTok"/>
+        </w:rPr>
+        <w:t xml:space="preserve">if</w:t>
+      </w:r>
+      <w:r>
+        <w:rPr>
+          <w:rStyle w:val="NormalTok"/>
+        </w:rPr>
+        <w:t xml:space="preserve"> </w:t>
+      </w:r>
+      <w:r>
+        <w:rPr>
+          <w:rStyle w:val="FunctionTok"/>
+        </w:rPr>
+        <w:t xml:space="preserve">all</w:t>
+      </w:r>
+      <w:r>
+        <w:rPr>
+          <w:rStyle w:val="NormalTok"/>
+        </w:rPr>
+        <w:t xml:space="preserve">(x </w:t>
+      </w:r>
+      <w:r>
+        <w:rPr>
+          <w:rStyle w:val="OperatorTok"/>
+        </w:rPr>
+        <w:t xml:space="preserve">-&gt;</w:t>
+      </w:r>
+      <w:r>
+        <w:rPr>
+          <w:rStyle w:val="NormalTok"/>
+        </w:rPr>
+        <w:t xml:space="preserve"> </w:t>
+      </w:r>
+      <w:r>
+        <w:rPr>
+          <w:rStyle w:val="FunctionTok"/>
+        </w:rPr>
+        <w:t xml:space="preserve">isfinite</w:t>
+      </w:r>
+      <w:r>
+        <w:rPr>
+          <w:rStyle w:val="NormalTok"/>
+        </w:rPr>
+        <w:t xml:space="preserve">(x) </w:t>
       </w:r>
       <w:r>
         <w:rPr>
@@ -4038,43 +4089,19 @@
         <w:rPr>
           <w:rStyle w:val="NormalTok"/>
         </w:rPr>
-        <w:t xml:space="preserve"> </w:t>
-      </w:r>
-      <w:r>
-        <w:rPr>
-          <w:rStyle w:val="FunctionTok"/>
-        </w:rPr>
-        <w:t xml:space="preserve">all</w:t>
-      </w:r>
-      <w:r>
-        <w:rPr>
-          <w:rStyle w:val="NormalTok"/>
-        </w:rPr>
-        <w:t xml:space="preserve">(x </w:t>
-      </w:r>
-      <w:r>
-        <w:rPr>
-          <w:rStyle w:val="OperatorTok"/>
-        </w:rPr>
-        <w:t xml:space="preserve">-&gt;</w:t>
-      </w:r>
-      <w:r>
-        <w:rPr>
-          <w:rStyle w:val="NormalTok"/>
-        </w:rPr>
-        <w:t xml:space="preserve"> </w:t>
-      </w:r>
-      <w:r>
-        <w:rPr>
-          <w:rStyle w:val="FunctionTok"/>
-        </w:rPr>
-        <w:t xml:space="preserve">isfinite</w:t>
-      </w:r>
-      <w:r>
-        <w:rPr>
-          <w:rStyle w:val="NormalTok"/>
-        </w:rPr>
-        <w:t xml:space="preserve">(x) </w:t>
+        <w:t xml:space="preserve"> !</w:t>
+      </w:r>
+      <w:r>
+        <w:rPr>
+          <w:rStyle w:val="FunctionTok"/>
+        </w:rPr>
+        <w:t xml:space="preserve">isnan</w:t>
+      </w:r>
+      <w:r>
+        <w:rPr>
+          <w:rStyle w:val="NormalTok"/>
+        </w:rPr>
+        <w:t xml:space="preserve">(x), f_safe) </w:t>
       </w:r>
       <w:r>
         <w:rPr>
@@ -4086,30 +4113,6 @@
         <w:rPr>
           <w:rStyle w:val="NormalTok"/>
         </w:rPr>
-        <w:t xml:space="preserve"> !</w:t>
-      </w:r>
-      <w:r>
-        <w:rPr>
-          <w:rStyle w:val="FunctionTok"/>
-        </w:rPr>
-        <w:t xml:space="preserve">isnan</w:t>
-      </w:r>
-      <w:r>
-        <w:rPr>
-          <w:rStyle w:val="NormalTok"/>
-        </w:rPr>
-        <w:t xml:space="preserve">(x), f_safe) </w:t>
-      </w:r>
-      <w:r>
-        <w:rPr>
-          <w:rStyle w:val="OperatorTok"/>
-        </w:rPr>
-        <w:t xml:space="preserve">&amp;&amp;</w:t>
-      </w:r>
-      <w:r>
-        <w:rPr>
-          <w:rStyle w:val="NormalTok"/>
-        </w:rPr>
         <w:t xml:space="preserve"> </w:t>
       </w:r>
       <w:r>
@@ -4185,7 +4188,7 @@
         <w:rPr>
           <w:rStyle w:val="NormalTok"/>
         </w:rPr>
-        <w:t xml:space="preserve">        th </w:t>
+        <w:t xml:space="preserve">            th </w:t>
       </w:r>
       <w:r>
         <w:rPr>
@@ -4210,6 +4213,69 @@
           <w:rStyle w:val="NormalTok"/>
         </w:rPr>
         <w:t xml:space="preserve">(K, f_safe)</w:t>
+      </w:r>
+      <w:r>
+        <w:br/>
+      </w:r>
+      <w:r>
+        <w:rPr>
+          <w:rStyle w:val="NormalTok"/>
+        </w:rPr>
+        <w:t xml:space="preserve">        </w:t>
+      </w:r>
+      <w:r>
+        <w:rPr>
+          <w:rStyle w:val="ControlFlowTok"/>
+        </w:rPr>
+        <w:t xml:space="preserve">else</w:t>
+      </w:r>
+      <w:r>
+        <w:br/>
+      </w:r>
+      <w:r>
+        <w:rPr>
+          <w:rStyle w:val="NormalTok"/>
+        </w:rPr>
+        <w:t xml:space="preserve">            Turing.</w:t>
+      </w:r>
+      <w:r>
+        <w:rPr>
+          <w:rStyle w:val="PreprocessorTok"/>
+        </w:rPr>
+        <w:t xml:space="preserve">@addlogprob</w:t>
+      </w:r>
+      <w:r>
+        <w:rPr>
+          <w:rStyle w:val="NormalTok"/>
+        </w:rPr>
+        <w:t xml:space="preserve">! </w:t>
+      </w:r>
+      <w:r>
+        <w:rPr>
+          <w:rStyle w:val="OperatorTok"/>
+        </w:rPr>
+        <w:t xml:space="preserve">-</w:t>
+      </w:r>
+      <w:r>
+        <w:rPr>
+          <w:rStyle w:val="ConstantTok"/>
+        </w:rPr>
+        <w:t xml:space="preserve">Inf</w:t>
+      </w:r>
+      <w:r>
+        <w:br/>
+      </w:r>
+      <w:r>
+        <w:rPr>
+          <w:rStyle w:val="NormalTok"/>
+        </w:rPr>
+        <w:t xml:space="preserve">        </w:t>
+      </w:r>
+      <w:r>
+        <w:rPr>
+          <w:rStyle w:val="ControlFlowTok"/>
+        </w:rPr>
+        <w:t xml:space="preserve">end</w:t>
       </w:r>
       <w:r>
         <w:br/>
@@ -9973,13 +10039,13 @@
     </w:p>
     <w:bookmarkEnd w:id="28"/>
     <w:bookmarkEnd w:id="29"/>
-    <w:bookmarkStart w:id="31" w:name="Xab5e58e0080282279151896d855d8c29732707c"/>
+    <w:bookmarkStart w:id="31" w:name="infection-timing-equivalence"/>
     <w:p>
       <w:pPr>
         <w:pStyle w:val="Heading1"/>
       </w:pPr>
       <w:r>
-        <w:t xml:space="preserve">Why the two paradigms agree on infection timing</w:t>
+        <w:t xml:space="preserve">Infection Timing Equivalence</w:t>
       </w:r>
     </w:p>
     <w:p>
@@ -9987,7 +10053,7 @@
         <w:pStyle w:val="FirstParagraph"/>
       </w:pPr>
       <w:r>
-        <w:t xml:space="preserve">The count likelihood and DDSA align more closely than it first appears. Independent Poisson daily counts, conditioned on their total</w:t>
+        <w:t xml:space="preserve">Independent Poisson daily counts, conditioned on their total</w:t>
       </w:r>
       <w:r>
         <w:t xml:space="preserve"> </w:t>
@@ -9998,7 +10064,7 @@
         </m:r>
       </m:oMath>
       <w:r>
-        <w:t xml:space="preserve">, are exactly</w:t>
+        <w:t xml:space="preserve">, follow a</w:t>
       </w:r>
       <w:r>
         <w:t xml:space="preserve"> </w:t>
@@ -10094,7 +10160,10 @@
         </m:d>
       </m:oMath>
       <w:r>
-        <w:t xml:space="preserve">, just like DDSA’s infection-time term. The count–Poisson log-likelihood therefore factorises as</w:t>
+        <w:t xml:space="preserve"> </w:t>
+      </w:r>
+      <w:r>
+        <w:t xml:space="preserve">distribution—identical to the infection-time term in DDSA. The count–Poisson log-likelihood therefore factorises as</w:t>
       </w:r>
     </w:p>
     <w:p>
@@ -10548,7 +10617,7 @@
         <w:pStyle w:val="FirstParagraph"/>
       </w:pPr>
       <w:r>
-        <w:t xml:space="preserve">DDSA keeps the multinomial timing term, swaps the Poisson final-size factor for</w:t>
+        <w:t xml:space="preserve">DDSA uses this multinomial timing term but replaces the Poisson final-size factor with</w:t>
       </w:r>
       <w:r>
         <w:t xml:space="preserve"> </w:t>
@@ -10626,7 +10695,10 @@
         </m:d>
       </m:oMath>
       <w:r>
-        <w:t xml:space="preserve">—the natural counterpart when the at-risk population</w:t>
+        <w:t xml:space="preserve"> </w:t>
+      </w:r>
+      <w:r>
+        <w:t xml:space="preserve">to explicitly account for a known at-risk population</w:t>
       </w:r>
       <w:r>
         <w:t xml:space="preserve"> </w:t>
@@ -10637,10 +10709,7 @@
         </m:r>
       </m:oMath>
       <w:r>
-        <w:t xml:space="preserve"> </w:t>
-      </w:r>
-      <w:r>
-        <w:t xml:space="preserve">is known—and adds a recovery-interval term that aggregated counts cannot represent. Under Poisson noise, a correctly specified infectious period, and large</w:t>
+        <w:t xml:space="preserve">. It also introduces a recovery-interval term that aggregated counts cannot capture. Assuming Poisson noise, a correctly specified infectious period, and large</w:t>
       </w:r>
       <w:r>
         <w:t xml:space="preserve"> </w:t>
@@ -10651,7 +10720,7 @@
         </m:r>
       </m:oMath>
       <w:r>
-        <w:t xml:space="preserve">, the two approaches agree on infection timing. They diverge where the line list carries extra information: individual recovery durations (identifying IP mean and shape) and a tighter small-</w:t>
+        <w:t xml:space="preserve">, both approaches yield consistent infection timing. They diverge only when the line list provides higher-resolution data: individual recovery durations (which identify the IP mean and shape) and tighter small-</w:t>
       </w:r>
       <m:oMath>
         <m:r>
@@ -10662,7 +10731,7 @@
         <w:t xml:space="preserve"> </w:t>
       </w:r>
       <w:r>
-        <w:t xml:space="preserve">final-size constraint. For the ODE comparator,</w:t>
+        <w:t xml:space="preserve">final-size constraints. For the ODE model,</w:t>
       </w:r>
       <w:r>
         <w:t xml:space="preserve"> </w:t>
@@ -10685,7 +10754,7 @@
         <w:t xml:space="preserve"> </w:t>
       </w:r>
       <w:r>
-        <w:t xml:space="preserve">comes from a continuous solve sampled at integer days, so its timing PMF</w:t>
+        <w:t xml:space="preserve">is sampled from a continuous solution at integer days, so its timing PMF</w:t>
       </w:r>
       <w:r>
         <w:t xml:space="preserve"> </w:t>
@@ -10699,7 +10768,7 @@
         <w:t xml:space="preserve"> </w:t>
       </w:r>
       <w:r>
-        <w:t xml:space="preserve">matches DDSA’s only up to discretisation. The chunk below verifies the factorisation on the exponential ODE’s mean curve at the generative truth:</w:t>
+        <w:t xml:space="preserve">matches DDSA’s only up to discretisation error. The following Julia implementation demonstrates this factorisation on the exponential ODE’s mean curve:</w:t>
       </w:r>
     </w:p>
     <w:bookmarkStart w:id="30" w:name="equivalence"/>
@@ -11579,13 +11648,13 @@
     </w:p>
     <w:bookmarkEnd w:id="30"/>
     <w:bookmarkEnd w:id="31"/>
-    <w:bookmarkStart w:id="33" w:name="fit-all-five"/>
+    <w:bookmarkStart w:id="33" w:name="fitting-all-models"/>
     <w:p>
       <w:pPr>
         <w:pStyle w:val="Heading1"/>
       </w:pPr>
       <w:r>
-        <w:t xml:space="preserve">Fit all five</w:t>
+        <w:t xml:space="preserve">Fitting all models</w:t>
       </w:r>
     </w:p>
     <w:p>
@@ -11593,7 +11662,7 @@
         <w:pStyle w:val="FirstParagraph"/>
       </w:pPr>
       <w:r>
-        <w:t xml:space="preserve">For the three</w:t>
+        <w:t xml:space="preserve">All five models are sampled with 2000 warm-up and 2000 posterior draws. The three</w:t>
       </w:r>
       <w:r>
         <w:t xml:space="preserve"> </w:t>
@@ -11604,18 +11673,25 @@
         </m:r>
       </m:oMath>
       <w:r>
-        <w:t xml:space="preserve">-free count models we use high target-accept / deep-tree NUTS settings to clear divergences on the weak</w:t>
-      </w:r>
-      <w:r>
-        <w:t xml:space="preserve"> </w:t>
-      </w:r>
-      <m:oMath>
-        <m:r>
-          <m:t>β</m:t>
-        </m:r>
-      </m:oMath>
-      <w:r>
-        <w:t xml:space="preserve">–</w:t>
+        <w:t xml:space="preserve">-free count models use NUTS with target acceptance 0.95 and</w:t>
+      </w:r>
+      <w:r>
+        <w:t xml:space="preserve"> </w:t>
+      </w:r>
+      <w:r>
+        <w:rPr>
+          <w:rStyle w:val="VerbatimChar"/>
+        </w:rPr>
+        <w:t xml:space="preserve">max_depth</w:t>
+      </w:r>
+      <w:r>
+        <w:t xml:space="preserve"> </w:t>
+      </w:r>
+      <w:r>
+        <w:t xml:space="preserve">12. The</w:t>
+      </w:r>
+      <w:r>
+        <w:t xml:space="preserve"> </w:t>
       </w:r>
       <m:oMath>
         <m:r>
@@ -11623,21 +11699,7 @@
         </m:r>
       </m:oMath>
       <w:r>
-        <w:t xml:space="preserve"> </w:t>
-      </w:r>
-      <w:r>
-        <w:t xml:space="preserve">ridge, so that wide posteriors reflect weak identifiability rather than sampler failure. The</w:t>
-      </w:r>
-      <w:r>
-        <w:t xml:space="preserve"> </w:t>
-      </w:r>
-      <m:oMath>
-        <m:r>
-          <m:t>γ</m:t>
-        </m:r>
-      </m:oMath>
-      <w:r>
-        <w:t xml:space="preserve">-fixed model is well behaved and uses milder NUTS. DDSA mixes discrete shape</w:t>
+        <w:t xml:space="preserve">-fixed model uses standard NUTS (target acceptance 0.8). DDSA uses a Gibbs scheme: Metropolis–Hastings for the discrete shape</w:t>
       </w:r>
       <w:r>
         <w:t xml:space="preserve"> </w:t>
@@ -11651,7 +11713,7 @@
         <w:t xml:space="preserve"> </w:t>
       </w:r>
       <w:r>
-        <w:t xml:space="preserve">(Metropolis–Hastings) with NUTS on</w:t>
+        <w:t xml:space="preserve">and NUTS on</w:t>
       </w:r>
       <w:r>
         <w:t xml:space="preserve"> </w:t>
@@ -12967,13 +13029,13 @@
     </w:p>
     <w:bookmarkEnd w:id="32"/>
     <w:bookmarkEnd w:id="33"/>
-    <w:bookmarkStart w:id="35" w:name="X4833bead5b08d0b55ca1922dee10013894634e2"/>
+    <w:bookmarkStart w:id="35" w:name="results"/>
     <w:p>
       <w:pPr>
         <w:pStyle w:val="Heading1"/>
       </w:pPr>
       <w:r>
-        <w:t xml:space="preserve">Results: derived quantities, convergence, prior reference</w:t>
+        <w:t xml:space="preserve">Results</w:t>
       </w:r>
     </w:p>
     <w:p>
@@ -12981,7 +13043,7 @@
         <w:pStyle w:val="FirstParagraph"/>
       </w:pPr>
       <w:r>
-        <w:t xml:space="preserve">The section below displays convergence diagnostics (</w:t>
+        <w:t xml:space="preserve">Convergence diagnostics (</w:t>
       </w:r>
       <m:oMath>
         <m:acc>
@@ -13030,7 +13092,7 @@
         <w:t xml:space="preserve"> </w:t>
       </w:r>
       <w:r>
-        <w:t xml:space="preserve">by model.</w:t>
+        <w:t xml:space="preserve">are reported by model.</w:t>
       </w:r>
     </w:p>
     <w:bookmarkStart w:id="34" w:name="summary"/>
@@ -16099,55 +16161,7 @@
         <w:pStyle w:val="FirstParagraph"/>
       </w:pPr>
       <w:r>
-        <w:t xml:space="preserve">Panel</w:t>
-      </w:r>
-      <w:r>
-        <w:t xml:space="preserve"> </w:t>
-      </w:r>
-      <w:r>
-        <w:rPr>
-          <w:b/>
-          <w:bCs/>
-        </w:rPr>
-        <w:t xml:space="preserve">(A)</w:t>
-      </w:r>
-      <w:r>
-        <w:t xml:space="preserve"> </w:t>
-      </w:r>
-      <w:r>
-        <w:t xml:space="preserve">overlays observed daily incidence (grey bars) with posterior-predictive medians; 95% bands are shown only for the exponential-NegBin ODE and DDSA to limit clutter. All models track the incidence curve equally well — the shared count data do not discriminate among them. Panels</w:t>
-      </w:r>
-      <w:r>
-        <w:t xml:space="preserve"> </w:t>
-      </w:r>
-      <w:r>
-        <w:rPr>
-          <w:b/>
-          <w:bCs/>
-        </w:rPr>
-        <w:t xml:space="preserve">(B)</w:t>
-      </w:r>
-      <w:r>
-        <w:t xml:space="preserve"> </w:t>
-      </w:r>
-      <w:r>
-        <w:t xml:space="preserve">and</w:t>
-      </w:r>
-      <w:r>
-        <w:t xml:space="preserve"> </w:t>
-      </w:r>
-      <w:r>
-        <w:rPr>
-          <w:b/>
-          <w:bCs/>
-        </w:rPr>
-        <w:t xml:space="preserve">(C)</w:t>
-      </w:r>
-      <w:r>
-        <w:t xml:space="preserve"> </w:t>
-      </w:r>
-      <w:r>
-        <w:t xml:space="preserve">show posterior densities for</w:t>
+        <w:t xml:space="preserve">Panel (A) shows observed daily incidence with posterior-predictive medians and 95% bands for the exponential-NegBin ODE and DDSA. All five models fit the incidence curve similarly. Panels (B) and (C) show posterior densities for</w:t>
       </w:r>
       <w:r>
         <w:t xml:space="preserve"> </w:t>
@@ -16170,7 +16184,71 @@
         <w:t xml:space="preserve"> </w:t>
       </w:r>
       <w:r>
-        <w:t xml:space="preserve">and mean infectious period; the dotted grey curve in (B) is the prior, and black dashed lines mark the generative truth (</w:t>
+        <w:t xml:space="preserve">and mean infectious period, with the prior (dotted) and true values (dashed) indicated.</w:t>
+      </w:r>
+    </w:p>
+    <w:p>
+      <w:pPr>
+        <w:pStyle w:val="BodyText"/>
+      </w:pPr>
+      <w:r>
+        <w:t xml:space="preserve">The count models with</w:t>
+      </w:r>
+      <w:r>
+        <w:t xml:space="preserve"> </w:t>
+      </w:r>
+      <m:oMath>
+        <m:r>
+          <m:t>γ</m:t>
+        </m:r>
+      </m:oMath>
+      <w:r>
+        <w:t xml:space="preserve"> </w:t>
+      </w:r>
+      <w:r>
+        <w:t xml:space="preserve">free (blue, purple) return posteriors covering nearly the full prior range. The width is similar whether or not the infectious period is correctly staged, suggesting the incidence curve provides limited joint information on</w:t>
+      </w:r>
+      <w:r>
+        <w:t xml:space="preserve"> </w:t>
+      </w:r>
+      <m:oMath>
+        <m:r>
+          <m:t>β</m:t>
+        </m:r>
+      </m:oMath>
+      <w:r>
+        <w:t xml:space="preserve"> </w:t>
+      </w:r>
+      <w:r>
+        <w:t xml:space="preserve">and</w:t>
+      </w:r>
+      <w:r>
+        <w:t xml:space="preserve"> </w:t>
+      </w:r>
+      <m:oMath>
+        <m:r>
+          <m:t>γ</m:t>
+        </m:r>
+      </m:oMath>
+      <w:r>
+        <w:t xml:space="preserve">. Fixing</w:t>
+      </w:r>
+      <w:r>
+        <w:t xml:space="preserve"> </w:t>
+      </w:r>
+      <m:oMath>
+        <m:r>
+          <m:t>γ</m:t>
+        </m:r>
+      </m:oMath>
+      <w:r>
+        <w:t xml:space="preserve"> </w:t>
+      </w:r>
+      <w:r>
+        <w:t xml:space="preserve">(green) concentrates the</w:t>
+      </w:r>
+      <w:r>
+        <w:t xml:space="preserve"> </w:t>
       </w:r>
       <m:oMath>
         <m:sSub>
@@ -16185,46 +16263,12 @@
             </m:r>
           </m:sub>
         </m:sSub>
-        <m:r>
-          <m:rPr>
-            <m:sty m:val="p"/>
-          </m:rPr>
-          <m:t>=</m:t>
-        </m:r>
-        <m:r>
-          <m:t>3.16</m:t>
-        </m:r>
       </m:oMath>
       <w:r>
-        <w:t xml:space="preserve">, mean IP</w:t>
-      </w:r>
-      <w:r>
-        <w:t xml:space="preserve"> </w:t>
-      </w:r>
-      <m:oMath>
-        <m:r>
-          <m:rPr>
-            <m:sty m:val="p"/>
-          </m:rPr>
-          <m:t>=</m:t>
-        </m:r>
-        <m:r>
-          <m:t>6.33</m:t>
-        </m:r>
-      </m:oMath>
-      <w:r>
-        <w:t xml:space="preserve"> </w:t>
-      </w:r>
-      <w:r>
-        <w:t xml:space="preserve">d).</w:t>
-      </w:r>
-    </w:p>
-    <w:p>
-      <w:pPr>
-        <w:pStyle w:val="BodyText"/>
-      </w:pPr>
-      <w:r>
-        <w:t xml:space="preserve">In (B),</w:t>
+        <w:t xml:space="preserve"> </w:t>
+      </w:r>
+      <w:r>
+        <w:t xml:space="preserve">posterior but shifts it below the truth: the continuous-time rate</w:t>
       </w:r>
       <w:r>
         <w:t xml:space="preserve"> </w:t>
@@ -16232,61 +16276,6 @@
       <m:oMath>
         <m:r>
           <m:t>γ</m:t>
-        </m:r>
-      </m:oMath>
-      <w:r>
-        <w:t xml:space="preserve">-free count posteriors (blue, purple) stay broad — near or overlapping the prior — reflecting the unresolved</w:t>
-      </w:r>
-      <w:r>
-        <w:t xml:space="preserve"> </w:t>
-      </w:r>
-      <m:oMath>
-        <m:r>
-          <m:t>β</m:t>
-        </m:r>
-      </m:oMath>
-      <w:r>
-        <w:t xml:space="preserve">–</w:t>
-      </w:r>
-      <m:oMath>
-        <m:r>
-          <m:t>γ</m:t>
-        </m:r>
-      </m:oMath>
-      <w:r>
-        <w:t xml:space="preserve"> </w:t>
-      </w:r>
-      <w:r>
-        <w:t xml:space="preserve">ridge. The</w:t>
-      </w:r>
-      <w:r>
-        <w:t xml:space="preserve"> </w:t>
-      </w:r>
-      <m:oMath>
-        <m:r>
-          <m:t>γ</m:t>
-        </m:r>
-      </m:oMath>
-      <w:r>
-        <w:t xml:space="preserve">-fixed ODE (green) narrows the posterior but is biased downward: fixing</w:t>
-      </w:r>
-      <w:r>
-        <w:t xml:space="preserve"> </w:t>
-      </w:r>
-      <m:oMath>
-        <m:r>
-          <m:t>γ</m:t>
-        </m:r>
-      </m:oMath>
-      <w:r>
-        <w:t xml:space="preserve"> </w:t>
-      </w:r>
-      <w:r>
-        <w:t xml:space="preserve">at the assumed continuous-time mean (</w:t>
-      </w:r>
-      <m:oMath>
-        <m:r>
-          <m:t>μ</m:t>
         </m:r>
         <m:r>
           <m:rPr>
@@ -16295,6 +16284,15 @@
           <m:t>=</m:t>
         </m:r>
         <m:r>
+          <m:t>1</m:t>
+        </m:r>
+        <m:r>
+          <m:rPr>
+            <m:sty m:val="p"/>
+          </m:rPr>
+          <m:t>/</m:t>
+        </m:r>
+        <m:r>
           <m:t>4</m:t>
         </m:r>
       </m:oMath>
@@ -16302,7 +16300,7 @@
         <w:t xml:space="preserve"> </w:t>
       </w:r>
       <w:r>
-        <w:t xml:space="preserve">d) overestimates the removal rate relative to the effective discrete IP, so the inferred</w:t>
+        <w:t xml:space="preserve">overestimates the removal rate relative to the effective discrete infectious period of 6.33 d. DDSA (red), informed by the individual recovery intervals, recovers both</w:t>
       </w:r>
       <w:r>
         <w:t xml:space="preserve"> </w:t>
@@ -16320,61 +16318,12 @@
             </m:r>
           </m:sub>
         </m:sSub>
-        <m:r>
-          <m:rPr>
-            <m:sty m:val="p"/>
-          </m:rPr>
-          <m:t>=</m:t>
-        </m:r>
-        <m:acc>
-          <m:accPr>
-            <m:chr m:val="̂"/>
-          </m:accPr>
-          <m:e>
-            <m:r>
-              <m:t>β</m:t>
-            </m:r>
-          </m:e>
-        </m:acc>
-        <m:r>
-          <m:rPr>
-            <m:sty m:val="p"/>
-          </m:rPr>
-          <m:t>/</m:t>
-        </m:r>
-        <m:sSub>
-          <m:e>
-            <m:r>
-              <m:t>γ</m:t>
-            </m:r>
-          </m:e>
-          <m:sub>
-            <m:r>
-              <m:rPr>
-                <m:sty m:val="p"/>
-              </m:rPr>
-              <m:t>f</m:t>
-            </m:r>
-            <m:r>
-              <m:rPr>
-                <m:sty m:val="p"/>
-              </m:rPr>
-              <m:t>i</m:t>
-            </m:r>
-            <m:r>
-              <m:rPr>
-                <m:sty m:val="p"/>
-              </m:rPr>
-              <m:t>x</m:t>
-            </m:r>
-          </m:sub>
-        </m:sSub>
       </m:oMath>
       <w:r>
         <w:t xml:space="preserve"> </w:t>
       </w:r>
       <w:r>
-        <w:t xml:space="preserve">undershoots the truth. Only DDSA (red) concentrates near the truth. In (C), only DDSA recovers the mean IP from data (model 4 not shown as it has no IP posterior).</w:t>
+        <w:t xml:space="preserve">and the mean infectious period without fixing either.</w:t>
       </w:r>
     </w:p>
     <w:p>
@@ -20291,19 +20240,15 @@
         <w:pStyle w:val="FirstParagraph"/>
       </w:pPr>
       <w:r>
-        <w:t xml:space="preserve">When only an incidence curve is available, ODE count models are appropriate. For infection timing, they are closely related to DDSA: a Poisson count likelihood conditioned on its total is exactly DDSA’s multinomial onset term. Looking at panel (A), all five models produce posterior predictive curves that cover the observed incidence (the count data alone do not discriminate among them). Panels (B) and (C) reveal what each practitioner choice does and does not recover.</w:t>
+        <w:t xml:space="preserve">Count likelihoods and DDSA share the same infection-timing information: a Poisson count likelihood conditioned on its total is exactly DDSA’s multinomial onset term. All five models fit the incidence curve comparably, so the differences between them lie not in goodness of fit but in what each recovers about the underlying epidemic parameters.</w:t>
       </w:r>
     </w:p>
     <w:p>
       <w:pPr>
-        <w:pStyle w:val="Compact"/>
-        <w:numPr>
-          <w:ilvl w:val="0"/>
-          <w:numId w:val="1001"/>
-        </w:numPr>
+        <w:pStyle w:val="BodyText"/>
       </w:pPr>
       <w:r>
-        <w:t xml:space="preserve">Models 1–2 (Poisson and NegBin,</w:t>
+        <w:t xml:space="preserve">Count models with</w:t>
       </w:r>
       <w:r>
         <w:t xml:space="preserve"> </w:t>
@@ -20317,7 +20262,7 @@
         <w:t xml:space="preserve"> </w:t>
       </w:r>
       <w:r>
-        <w:t xml:space="preserve">free):</w:t>
+        <w:t xml:space="preserve">free (Models 1–3) return posteriors covering much of the prior for both</w:t>
       </w:r>
       <w:r>
         <w:t xml:space="preserve"> </w:t>
@@ -20340,21 +20285,7 @@
         <w:t xml:space="preserve"> </w:t>
       </w:r>
       <w:r>
-        <w:t xml:space="preserve">posteriors in panel (B) are broad and overlap the prior, reflecting weak joint identifiability of</w:t>
-      </w:r>
-      <w:r>
-        <w:t xml:space="preserve"> </w:t>
-      </w:r>
-      <m:oMath>
-        <m:r>
-          <m:t>β</m:t>
-        </m:r>
-      </m:oMath>
-      <w:r>
-        <w:t xml:space="preserve"> </w:t>
-      </w:r>
-      <w:r>
-        <w:t xml:space="preserve">and</w:t>
+        <w:t xml:space="preserve">and the mean IP; this holds whether or not the infectious period is correctly staged. Fixing</w:t>
       </w:r>
       <w:r>
         <w:t xml:space="preserve"> </w:t>
@@ -20368,73 +20299,7 @@
         <w:t xml:space="preserve"> </w:t>
       </w:r>
       <w:r>
-        <w:t xml:space="preserve">from counts alone. The mean IP posterior in panel (C) is equally diffuse.</w:t>
-      </w:r>
-    </w:p>
-    <w:p>
-      <w:pPr>
-        <w:pStyle w:val="Compact"/>
-        <w:numPr>
-          <w:ilvl w:val="0"/>
-          <w:numId w:val="1001"/>
-        </w:numPr>
-      </w:pPr>
-      <w:r>
-        <w:t xml:space="preserve">Model 3 (staged ODE,</w:t>
-      </w:r>
-      <w:r>
-        <w:t xml:space="preserve"> </w:t>
-      </w:r>
-      <m:oMath>
-        <m:r>
-          <m:t>γ</m:t>
-        </m:r>
-      </m:oMath>
-      <w:r>
-        <w:t xml:space="preserve"> </w:t>
-      </w:r>
-      <w:r>
-        <w:t xml:space="preserve">free): a practitioner who suspects a non-exponential IP and uses the correctly staged model still cannot identify the IP mean, the purple curve in panel (B) remains diffuse.</w:t>
-      </w:r>
-    </w:p>
-    <w:p>
-      <w:pPr>
-        <w:pStyle w:val="Compact"/>
-        <w:numPr>
-          <w:ilvl w:val="0"/>
-          <w:numId w:val="1001"/>
-        </w:numPr>
-      </w:pPr>
-      <w:r>
-        <w:t xml:space="preserve">Model 4 (exponential,</w:t>
-      </w:r>
-      <w:r>
-        <w:t xml:space="preserve"> </w:t>
-      </w:r>
-      <m:oMath>
-        <m:r>
-          <m:t>γ</m:t>
-        </m:r>
-      </m:oMath>
-      <w:r>
-        <w:t xml:space="preserve"> </w:t>
-      </w:r>
-      <w:r>
-        <w:t xml:space="preserve">fixed from literature): anchoring</w:t>
-      </w:r>
-      <w:r>
-        <w:t xml:space="preserve"> </w:t>
-      </w:r>
-      <m:oMath>
-        <m:r>
-          <m:t>γ</m:t>
-        </m:r>
-      </m:oMath>
-      <w:r>
-        <w:t xml:space="preserve"> </w:t>
-      </w:r>
-      <w:r>
-        <w:t xml:space="preserve">at the assumed continuous-time mean IP of 4 d narrows the</w:t>
+        <w:t xml:space="preserve">from the literature (Model 4) narrows the</w:t>
       </w:r>
       <w:r>
         <w:t xml:space="preserve"> </w:t>
@@ -20457,7 +20322,7 @@
         <w:t xml:space="preserve"> </w:t>
       </w:r>
       <w:r>
-        <w:t xml:space="preserve">posterior, but the 95% CrI lies below truth. Fixing</w:t>
+        <w:t xml:space="preserve">posterior but introduces a downward bias: the continuous-time rate</w:t>
       </w:r>
       <w:r>
         <w:t xml:space="preserve"> </w:t>
@@ -20489,7 +20354,7 @@
         <w:t xml:space="preserve"> </w:t>
       </w:r>
       <w:r>
-        <w:t xml:space="preserve">overestimates the removal rate relative to the effective discrete IP of 6.33 d, so the inferred</w:t>
+        <w:t xml:space="preserve">overestimates removal relative to the effective discrete IP of 6.33 d, so the inferred</w:t>
       </w:r>
       <w:r>
         <w:t xml:space="preserve"> </w:t>
@@ -20561,7 +20426,7 @@
         <w:t xml:space="preserve"> </w:t>
       </w:r>
       <w:r>
-        <w:t xml:space="preserve">is too small even as</w:t>
+        <w:t xml:space="preserve">undershoots the truth even as</w:t>
       </w:r>
       <w:r>
         <w:t xml:space="preserve"> </w:t>
@@ -20582,19 +20447,7 @@
         <w:t xml:space="preserve"> </w:t>
       </w:r>
       <w:r>
-        <w:t xml:space="preserve">rises to fit the epidemic curve. This bias would persist undetected without access to individual recovery times.</w:t>
-      </w:r>
-    </w:p>
-    <w:p>
-      <w:pPr>
-        <w:pStyle w:val="Compact"/>
-        <w:numPr>
-          <w:ilvl w:val="0"/>
-          <w:numId w:val="1001"/>
-        </w:numPr>
-      </w:pPr>
-      <w:r>
-        <w:t xml:space="preserve">Model 5 (DDSA):</w:t>
+        <w:t xml:space="preserve">adjusts upward to fit the incidence curve. This bias was not apparent from incidence data in this example. DDSA (Model 5), using the same incidence together with recovery intervals and final size, recovers</w:t>
       </w:r>
       <w:r>
         <w:t xml:space="preserve"> </w:t>
@@ -20614,18 +20467,15 @@
         </m:sSub>
       </m:oMath>
       <w:r>
-        <w:t xml:space="preserve"> </w:t>
-      </w:r>
-      <w:r>
-        <w:t xml:space="preserve">and mean IP both concentrate near the truth in panels (B) and (C), inferred jointly from the line list without fixing any IP parameter externally.</w:t>
+        <w:t xml:space="preserve">, mean IP, and dwell-time shape without fixing any IP parameter externally.</w:t>
       </w:r>
     </w:p>
     <w:p>
       <w:pPr>
-        <w:pStyle w:val="FirstParagraph"/>
+        <w:pStyle w:val="BodyText"/>
       </w:pPr>
       <w:r>
-        <w:t xml:space="preserve">Both aggregated counts and individual line lists provide useful information about an outbreak. When only daily incidence is available, count models are the natural tool. They fit the epidemic curve well and are easy to specify. When a line list is also available, DDSA can additionally recover the infectious-period distribution from individual recovery times, identifying both the mean IP and its shape without external assumptions. The practical consequence, illustrated by Model 4, is that shape misspecification introduces R₀ bias that incidence data alone cannot reveal.</w:t>
+        <w:t xml:space="preserve">When only daily incidence is available, count models can be the natural choice. When a line list is also available, the recovery intervals provide information that aggregated counts cannot: they can help identify both the mean IP and its shape, and may reveal biases introduced by external IP assumptions that are difficult to detect from incidence data alone.</w:t>
       </w:r>
     </w:p>
     <w:bookmarkEnd w:id="43"/>
@@ -20739,114 +20589,8 @@
       </w:pPr>
     </w:lvl>
   </w:abstractNum>
-  <w:abstractNum w:abstractNumId="991">
-    <w:nsid w:val="0000A991"/>
-    <w:multiLevelType w:val="multilevel"/>
-    <w:lvl w:ilvl="0">
-      <w:numFmt w:val="bullet"/>
-      <w:lvlText w:val=""/>
-      <w:lvlJc w:val="left"/>
-      <w:pPr>
-        <w:ind w:left="720" w:hanging="360"/>
-      </w:pPr>
-      <w:rPr>
-        <w:rFonts w:ascii="Symbol" w:hAnsi="Symbol" w:cs="Symbol" w:hint="default"/>
-      </w:rPr>
-    </w:lvl>
-    <w:lvl w:ilvl="1">
-      <w:numFmt w:val="bullet"/>
-      <w:lvlText w:val="o"/>
-      <w:lvlJc w:val="left"/>
-      <w:pPr>
-        <w:ind w:left="1440" w:hanging="360"/>
-      </w:pPr>
-      <w:rPr>
-        <w:rFonts w:ascii="Courier New" w:hAnsi="Courier New" w:cs="Courier New" w:hint="default"/>
-      </w:rPr>
-    </w:lvl>
-    <w:lvl w:ilvl="2">
-      <w:numFmt w:val="bullet"/>
-      <w:lvlText w:val=""/>
-      <w:lvlJc w:val="left"/>
-      <w:pPr>
-        <w:ind w:left="2160" w:hanging="360"/>
-      </w:pPr>
-      <w:rPr>
-        <w:rFonts w:ascii="Wingdings" w:hAnsi="Wingdings" w:cs="Wingdings" w:hint="default"/>
-      </w:rPr>
-    </w:lvl>
-    <w:lvl w:ilvl="3">
-      <w:numFmt w:val="bullet"/>
-      <w:lvlText w:val=""/>
-      <w:lvlJc w:val="left"/>
-      <w:pPr>
-        <w:ind w:left="2880" w:hanging="360"/>
-      </w:pPr>
-      <w:rPr>
-        <w:rFonts w:ascii="Symbol" w:hAnsi="Symbol" w:cs="Symbol" w:hint="default"/>
-      </w:rPr>
-    </w:lvl>
-    <w:lvl w:ilvl="4">
-      <w:numFmt w:val="bullet"/>
-      <w:lvlText w:val="o"/>
-      <w:lvlJc w:val="left"/>
-      <w:pPr>
-        <w:ind w:left="3600" w:hanging="360"/>
-      </w:pPr>
-      <w:rPr>
-        <w:rFonts w:ascii="Courier New" w:hAnsi="Courier New" w:cs="Courier New" w:hint="default"/>
-      </w:rPr>
-    </w:lvl>
-    <w:lvl w:ilvl="5">
-      <w:numFmt w:val="bullet"/>
-      <w:lvlText w:val=""/>
-      <w:lvlJc w:val="left"/>
-      <w:pPr>
-        <w:ind w:left="4320" w:hanging="360"/>
-      </w:pPr>
-      <w:rPr>
-        <w:rFonts w:ascii="Wingdings" w:hAnsi="Wingdings" w:cs="Wingdings" w:hint="default"/>
-      </w:rPr>
-    </w:lvl>
-    <w:lvl w:ilvl="6">
-      <w:numFmt w:val="bullet"/>
-      <w:lvlText w:val=""/>
-      <w:lvlJc w:val="left"/>
-      <w:pPr>
-        <w:ind w:left="5040" w:hanging="360"/>
-      </w:pPr>
-      <w:rPr>
-        <w:rFonts w:ascii="Symbol" w:hAnsi="Symbol" w:cs="Symbol" w:hint="default"/>
-      </w:rPr>
-    </w:lvl>
-    <w:lvl w:ilvl="7">
-      <w:numFmt w:val="bullet"/>
-      <w:lvlText w:val="o"/>
-      <w:lvlJc w:val="left"/>
-      <w:pPr>
-        <w:ind w:left="5760" w:hanging="360"/>
-      </w:pPr>
-      <w:rPr>
-        <w:rFonts w:ascii="Courier New" w:hAnsi="Courier New" w:cs="Courier New" w:hint="default"/>
-      </w:rPr>
-    </w:lvl>
-    <w:lvl w:ilvl="8">
-      <w:numFmt w:val="bullet"/>
-      <w:lvlText w:val=""/>
-      <w:lvlJc w:val="left"/>
-      <w:pPr>
-        <w:ind w:left="6480" w:hanging="360"/>
-      </w:pPr>
-      <w:rPr>
-        <w:rFonts w:ascii="Wingdings" w:hAnsi="Wingdings" w:cs="Wingdings" w:hint="default"/>
-      </w:rPr>
-    </w:lvl>
-  </w:abstractNum>
   <w:num w:numId="1000">
     <w:abstractNumId w:val="990"/>
-  </w:num>
-  <w:num w:numId="1001">
-    <w:abstractNumId w:val="991"/>
   </w:num>
 </w:numbering>
 </file>

</xml_diff>

<commit_message>
Fixing how result values are shown
</commit_message>
<xml_diff>
--- a/DDSA_vs_ODE_count/ddsa_vs_ode_count.docx
+++ b/DDSA_vs_ODE_count/ddsa_vs_ode_count.docx
@@ -12393,6 +12393,243 @@
         <w:rPr>
           <w:rStyle w:val="NormalTok"/>
         </w:rPr>
+        <w:t xml:space="preserve">(v)  </w:t>
+      </w:r>
+      <w:r>
+        <w:rPr>
+          <w:rStyle w:val="OperatorTok"/>
+        </w:rPr>
+        <w:t xml:space="preserve">=</w:t>
+      </w:r>
+      <w:r>
+        <w:rPr>
+          <w:rStyle w:val="NormalTok"/>
+        </w:rPr>
+        <w:t xml:space="preserve"> </w:t>
+      </w:r>
+      <w:r>
+        <w:rPr>
+          <w:rStyle w:val="StringTok"/>
+        </w:rPr>
+        <w:t xml:space="preserve">"</w:t>
+      </w:r>
+      <w:r>
+        <w:rPr>
+          <w:rStyle w:val="SpecialCharTok"/>
+        </w:rPr>
+        <w:t xml:space="preserve">$</w:t>
+      </w:r>
+      <w:r>
+        <w:rPr>
+          <w:rStyle w:val="NormalTok"/>
+        </w:rPr>
+        <w:t xml:space="preserve">(</w:t>
+      </w:r>
+      <w:r>
+        <w:rPr>
+          <w:rStyle w:val="FunctionTok"/>
+        </w:rPr>
+        <w:t xml:space="preserve">round</w:t>
+      </w:r>
+      <w:r>
+        <w:rPr>
+          <w:rStyle w:val="NormalTok"/>
+        </w:rPr>
+        <w:t xml:space="preserve">(</w:t>
+      </w:r>
+      <w:r>
+        <w:rPr>
+          <w:rStyle w:val="FunctionTok"/>
+        </w:rPr>
+        <w:t xml:space="preserve">median</w:t>
+      </w:r>
+      <w:r>
+        <w:rPr>
+          <w:rStyle w:val="NormalTok"/>
+        </w:rPr>
+        <w:t xml:space="preserve">(v),digits</w:t>
+      </w:r>
+      <w:r>
+        <w:rPr>
+          <w:rStyle w:val="OperatorTok"/>
+        </w:rPr>
+        <w:t xml:space="preserve">=</w:t>
+      </w:r>
+      <w:r>
+        <w:rPr>
+          <w:rStyle w:val="FloatTok"/>
+        </w:rPr>
+        <w:t xml:space="preserve">3</w:t>
+      </w:r>
+      <w:r>
+        <w:rPr>
+          <w:rStyle w:val="NormalTok"/>
+        </w:rPr>
+        <w:t xml:space="preserve">))</w:t>
+      </w:r>
+      <w:r>
+        <w:rPr>
+          <w:rStyle w:val="StringTok"/>
+        </w:rPr>
+        <w:t xml:space="preserve"> [</w:t>
+      </w:r>
+      <w:r>
+        <w:rPr>
+          <w:rStyle w:val="SpecialCharTok"/>
+        </w:rPr>
+        <w:t xml:space="preserve">$</w:t>
+      </w:r>
+      <w:r>
+        <w:rPr>
+          <w:rStyle w:val="NormalTok"/>
+        </w:rPr>
+        <w:t xml:space="preserve">(</w:t>
+      </w:r>
+      <w:r>
+        <w:rPr>
+          <w:rStyle w:val="FunctionTok"/>
+        </w:rPr>
+        <w:t xml:space="preserve">round</w:t>
+      </w:r>
+      <w:r>
+        <w:rPr>
+          <w:rStyle w:val="NormalTok"/>
+        </w:rPr>
+        <w:t xml:space="preserve">(</w:t>
+      </w:r>
+      <w:r>
+        <w:rPr>
+          <w:rStyle w:val="FunctionTok"/>
+        </w:rPr>
+        <w:t xml:space="preserve">quantile</w:t>
+      </w:r>
+      <w:r>
+        <w:rPr>
+          <w:rStyle w:val="NormalTok"/>
+        </w:rPr>
+        <w:t xml:space="preserve">(v,</w:t>
+      </w:r>
+      <w:r>
+        <w:rPr>
+          <w:rStyle w:val="FloatTok"/>
+        </w:rPr>
+        <w:t xml:space="preserve">0.025</w:t>
+      </w:r>
+      <w:r>
+        <w:rPr>
+          <w:rStyle w:val="NormalTok"/>
+        </w:rPr>
+        <w:t xml:space="preserve">),digits</w:t>
+      </w:r>
+      <w:r>
+        <w:rPr>
+          <w:rStyle w:val="OperatorTok"/>
+        </w:rPr>
+        <w:t xml:space="preserve">=</w:t>
+      </w:r>
+      <w:r>
+        <w:rPr>
+          <w:rStyle w:val="FloatTok"/>
+        </w:rPr>
+        <w:t xml:space="preserve">3</w:t>
+      </w:r>
+      <w:r>
+        <w:rPr>
+          <w:rStyle w:val="NormalTok"/>
+        </w:rPr>
+        <w:t xml:space="preserve">))</w:t>
+      </w:r>
+      <w:r>
+        <w:rPr>
+          <w:rStyle w:val="StringTok"/>
+        </w:rPr>
+        <w:t xml:space="preserve">, </w:t>
+      </w:r>
+      <w:r>
+        <w:rPr>
+          <w:rStyle w:val="SpecialCharTok"/>
+        </w:rPr>
+        <w:t xml:space="preserve">$</w:t>
+      </w:r>
+      <w:r>
+        <w:rPr>
+          <w:rStyle w:val="NormalTok"/>
+        </w:rPr>
+        <w:t xml:space="preserve">(</w:t>
+      </w:r>
+      <w:r>
+        <w:rPr>
+          <w:rStyle w:val="FunctionTok"/>
+        </w:rPr>
+        <w:t xml:space="preserve">round</w:t>
+      </w:r>
+      <w:r>
+        <w:rPr>
+          <w:rStyle w:val="NormalTok"/>
+        </w:rPr>
+        <w:t xml:space="preserve">(</w:t>
+      </w:r>
+      <w:r>
+        <w:rPr>
+          <w:rStyle w:val="FunctionTok"/>
+        </w:rPr>
+        <w:t xml:space="preserve">quantile</w:t>
+      </w:r>
+      <w:r>
+        <w:rPr>
+          <w:rStyle w:val="NormalTok"/>
+        </w:rPr>
+        <w:t xml:space="preserve">(v,</w:t>
+      </w:r>
+      <w:r>
+        <w:rPr>
+          <w:rStyle w:val="FloatTok"/>
+        </w:rPr>
+        <w:t xml:space="preserve">0.975</w:t>
+      </w:r>
+      <w:r>
+        <w:rPr>
+          <w:rStyle w:val="NormalTok"/>
+        </w:rPr>
+        <w:t xml:space="preserve">),digits</w:t>
+      </w:r>
+      <w:r>
+        <w:rPr>
+          <w:rStyle w:val="OperatorTok"/>
+        </w:rPr>
+        <w:t xml:space="preserve">=</w:t>
+      </w:r>
+      <w:r>
+        <w:rPr>
+          <w:rStyle w:val="FloatTok"/>
+        </w:rPr>
+        <w:t xml:space="preserve">3</w:t>
+      </w:r>
+      <w:r>
+        <w:rPr>
+          <w:rStyle w:val="NormalTok"/>
+        </w:rPr>
+        <w:t xml:space="preserve">))</w:t>
+      </w:r>
+      <w:r>
+        <w:rPr>
+          <w:rStyle w:val="StringTok"/>
+        </w:rPr>
+        <w:t xml:space="preserve">]"</w:t>
+      </w:r>
+      <w:r>
+        <w:br/>
+      </w:r>
+      <w:r>
+        <w:rPr>
+          <w:rStyle w:val="FunctionTok"/>
+        </w:rPr>
+        <w:t xml:space="preserve">qi</w:t>
+      </w:r>
+      <w:r>
+        <w:rPr>
+          <w:rStyle w:val="NormalTok"/>
+        </w:rPr>
         <w:t xml:space="preserve">(v) </w:t>
       </w:r>
       <w:r>
@@ -12405,10 +12642,1483 @@
         <w:rPr>
           <w:rStyle w:val="NormalTok"/>
         </w:rPr>
+        <w:t xml:space="preserve"> </w:t>
+      </w:r>
+      <w:r>
+        <w:rPr>
+          <w:rStyle w:val="StringTok"/>
+        </w:rPr>
+        <w:t xml:space="preserve">"</w:t>
+      </w:r>
+      <w:r>
+        <w:rPr>
+          <w:rStyle w:val="SpecialCharTok"/>
+        </w:rPr>
+        <w:t xml:space="preserve">$</w:t>
+      </w:r>
+      <w:r>
+        <w:rPr>
+          <w:rStyle w:val="NormalTok"/>
+        </w:rPr>
+        <w:t xml:space="preserve">(</w:t>
+      </w:r>
+      <w:r>
+        <w:rPr>
+          <w:rStyle w:val="FunctionTok"/>
+        </w:rPr>
+        <w:t xml:space="preserve">Int</w:t>
+      </w:r>
+      <w:r>
+        <w:rPr>
+          <w:rStyle w:val="NormalTok"/>
+        </w:rPr>
+        <w:t xml:space="preserve">(</w:t>
+      </w:r>
+      <w:r>
+        <w:rPr>
+          <w:rStyle w:val="FunctionTok"/>
+        </w:rPr>
+        <w:t xml:space="preserve">round</w:t>
+      </w:r>
+      <w:r>
+        <w:rPr>
+          <w:rStyle w:val="NormalTok"/>
+        </w:rPr>
+        <w:t xml:space="preserve">(</w:t>
+      </w:r>
+      <w:r>
+        <w:rPr>
+          <w:rStyle w:val="FunctionTok"/>
+        </w:rPr>
+        <w:t xml:space="preserve">median</w:t>
+      </w:r>
+      <w:r>
+        <w:rPr>
+          <w:rStyle w:val="NormalTok"/>
+        </w:rPr>
+        <w:t xml:space="preserve">(v))))</w:t>
+      </w:r>
+      <w:r>
+        <w:rPr>
+          <w:rStyle w:val="StringTok"/>
+        </w:rPr>
+        <w:t xml:space="preserve"> [</w:t>
+      </w:r>
+      <w:r>
+        <w:rPr>
+          <w:rStyle w:val="SpecialCharTok"/>
+        </w:rPr>
+        <w:t xml:space="preserve">$</w:t>
+      </w:r>
+      <w:r>
+        <w:rPr>
+          <w:rStyle w:val="NormalTok"/>
+        </w:rPr>
+        <w:t xml:space="preserve">(</w:t>
+      </w:r>
+      <w:r>
+        <w:rPr>
+          <w:rStyle w:val="FunctionTok"/>
+        </w:rPr>
+        <w:t xml:space="preserve">Int</w:t>
+      </w:r>
+      <w:r>
+        <w:rPr>
+          <w:rStyle w:val="NormalTok"/>
+        </w:rPr>
+        <w:t xml:space="preserve">(</w:t>
+      </w:r>
+      <w:r>
+        <w:rPr>
+          <w:rStyle w:val="FunctionTok"/>
+        </w:rPr>
+        <w:t xml:space="preserve">round</w:t>
+      </w:r>
+      <w:r>
+        <w:rPr>
+          <w:rStyle w:val="NormalTok"/>
+        </w:rPr>
+        <w:t xml:space="preserve">(</w:t>
+      </w:r>
+      <w:r>
+        <w:rPr>
+          <w:rStyle w:val="FunctionTok"/>
+        </w:rPr>
+        <w:t xml:space="preserve">quantile</w:t>
+      </w:r>
+      <w:r>
+        <w:rPr>
+          <w:rStyle w:val="NormalTok"/>
+        </w:rPr>
+        <w:t xml:space="preserve">(v,</w:t>
+      </w:r>
+      <w:r>
+        <w:rPr>
+          <w:rStyle w:val="FloatTok"/>
+        </w:rPr>
+        <w:t xml:space="preserve">0.025</w:t>
+      </w:r>
+      <w:r>
+        <w:rPr>
+          <w:rStyle w:val="NormalTok"/>
+        </w:rPr>
+        <w:t xml:space="preserve">))))</w:t>
+      </w:r>
+      <w:r>
+        <w:rPr>
+          <w:rStyle w:val="StringTok"/>
+        </w:rPr>
+        <w:t xml:space="preserve">, </w:t>
+      </w:r>
+      <w:r>
+        <w:rPr>
+          <w:rStyle w:val="SpecialCharTok"/>
+        </w:rPr>
+        <w:t xml:space="preserve">$</w:t>
+      </w:r>
+      <w:r>
+        <w:rPr>
+          <w:rStyle w:val="NormalTok"/>
+        </w:rPr>
+        <w:t xml:space="preserve">(</w:t>
+      </w:r>
+      <w:r>
+        <w:rPr>
+          <w:rStyle w:val="FunctionTok"/>
+        </w:rPr>
+        <w:t xml:space="preserve">Int</w:t>
+      </w:r>
+      <w:r>
+        <w:rPr>
+          <w:rStyle w:val="NormalTok"/>
+        </w:rPr>
+        <w:t xml:space="preserve">(</w:t>
+      </w:r>
+      <w:r>
+        <w:rPr>
+          <w:rStyle w:val="FunctionTok"/>
+        </w:rPr>
+        <w:t xml:space="preserve">round</w:t>
+      </w:r>
+      <w:r>
+        <w:rPr>
+          <w:rStyle w:val="NormalTok"/>
+        </w:rPr>
+        <w:t xml:space="preserve">(</w:t>
+      </w:r>
+      <w:r>
+        <w:rPr>
+          <w:rStyle w:val="FunctionTok"/>
+        </w:rPr>
+        <w:t xml:space="preserve">quantile</w:t>
+      </w:r>
+      <w:r>
+        <w:rPr>
+          <w:rStyle w:val="NormalTok"/>
+        </w:rPr>
+        <w:t xml:space="preserve">(v,</w:t>
+      </w:r>
+      <w:r>
+        <w:rPr>
+          <w:rStyle w:val="FloatTok"/>
+        </w:rPr>
+        <w:t xml:space="preserve">0.975</w:t>
+      </w:r>
+      <w:r>
+        <w:rPr>
+          <w:rStyle w:val="NormalTok"/>
+        </w:rPr>
+        <w:t xml:space="preserve">))))</w:t>
+      </w:r>
+      <w:r>
+        <w:rPr>
+          <w:rStyle w:val="StringTok"/>
+        </w:rPr>
+        <w:t xml:space="preserve">]"</w:t>
+      </w:r>
+      <w:r>
+        <w:br/>
+      </w:r>
+      <w:r>
+        <w:rPr>
+          <w:rStyle w:val="NormalTok"/>
+        </w:rPr>
+        <w:t xml:space="preserve">βp, γp </w:t>
+      </w:r>
+      <w:r>
+        <w:rPr>
+          <w:rStyle w:val="OperatorTok"/>
+        </w:rPr>
+        <w:t xml:space="preserve">=</w:t>
+      </w:r>
+      <w:r>
+        <w:rPr>
+          <w:rStyle w:val="NormalTok"/>
+        </w:rPr>
+        <w:t xml:space="preserve"> </w:t>
+      </w:r>
+      <w:r>
+        <w:rPr>
+          <w:rStyle w:val="FunctionTok"/>
+        </w:rPr>
+        <w:t xml:space="preserve">vec</w:t>
+      </w:r>
+      <w:r>
+        <w:rPr>
+          <w:rStyle w:val="NormalTok"/>
+        </w:rPr>
+        <w:t xml:space="preserve">(ch_pois[</w:t>
+      </w:r>
+      <w:r>
+        <w:rPr>
+          <w:rStyle w:val="OperatorTok"/>
+        </w:rPr>
+        <w:t xml:space="preserve">:</w:t>
+      </w:r>
+      <w:r>
+        <w:rPr>
+          <w:rStyle w:val="NormalTok"/>
+        </w:rPr>
+        <w:t xml:space="preserve">β]), </w:t>
+      </w:r>
+      <w:r>
+        <w:rPr>
+          <w:rStyle w:val="FunctionTok"/>
+        </w:rPr>
+        <w:t xml:space="preserve">vec</w:t>
+      </w:r>
+      <w:r>
+        <w:rPr>
+          <w:rStyle w:val="NormalTok"/>
+        </w:rPr>
+        <w:t xml:space="preserve">(ch_pois[</w:t>
+      </w:r>
+      <w:r>
+        <w:rPr>
+          <w:rStyle w:val="OperatorTok"/>
+        </w:rPr>
+        <w:t xml:space="preserve">:</w:t>
+      </w:r>
+      <w:r>
+        <w:rPr>
+          <w:rStyle w:val="NormalTok"/>
+        </w:rPr>
+        <w:t xml:space="preserve">γ]); R0p </w:t>
+      </w:r>
+      <w:r>
+        <w:rPr>
+          <w:rStyle w:val="OperatorTok"/>
+        </w:rPr>
+        <w:t xml:space="preserve">=</w:t>
+      </w:r>
+      <w:r>
+        <w:rPr>
+          <w:rStyle w:val="NormalTok"/>
+        </w:rPr>
+        <w:t xml:space="preserve"> βp </w:t>
+      </w:r>
+      <w:r>
+        <w:rPr>
+          <w:rStyle w:val="OperatorTok"/>
+        </w:rPr>
+        <w:t xml:space="preserve">./</w:t>
+      </w:r>
+      <w:r>
+        <w:rPr>
+          <w:rStyle w:val="NormalTok"/>
+        </w:rPr>
+        <w:t xml:space="preserve"> γp; ipp </w:t>
+      </w:r>
+      <w:r>
+        <w:rPr>
+          <w:rStyle w:val="OperatorTok"/>
+        </w:rPr>
+        <w:t xml:space="preserve">=</w:t>
+      </w:r>
+      <w:r>
+        <w:rPr>
+          <w:rStyle w:val="NormalTok"/>
+        </w:rPr>
+        <w:t xml:space="preserve"> </w:t>
+      </w:r>
+      <w:r>
+        <w:rPr>
+          <w:rStyle w:val="FloatTok"/>
+        </w:rPr>
+        <w:t xml:space="preserve">1.0</w:t>
+      </w:r>
+      <w:r>
+        <w:rPr>
+          <w:rStyle w:val="NormalTok"/>
+        </w:rPr>
+        <w:t xml:space="preserve"> </w:t>
+      </w:r>
+      <w:r>
+        <w:rPr>
+          <w:rStyle w:val="OperatorTok"/>
+        </w:rPr>
+        <w:t xml:space="preserve">./</w:t>
+      </w:r>
+      <w:r>
+        <w:rPr>
+          <w:rStyle w:val="NormalTok"/>
+        </w:rPr>
+        <w:t xml:space="preserve"> γp</w:t>
+      </w:r>
+      <w:r>
+        <w:br/>
+      </w:r>
+      <w:r>
+        <w:rPr>
+          <w:rStyle w:val="NormalTok"/>
+        </w:rPr>
+        <w:t xml:space="preserve">βe, γe </w:t>
+      </w:r>
+      <w:r>
+        <w:rPr>
+          <w:rStyle w:val="OperatorTok"/>
+        </w:rPr>
+        <w:t xml:space="preserve">=</w:t>
+      </w:r>
+      <w:r>
+        <w:rPr>
+          <w:rStyle w:val="NormalTok"/>
+        </w:rPr>
+        <w:t xml:space="preserve"> </w:t>
+      </w:r>
+      <w:r>
+        <w:rPr>
+          <w:rStyle w:val="FunctionTok"/>
+        </w:rPr>
+        <w:t xml:space="preserve">vec</w:t>
+      </w:r>
+      <w:r>
+        <w:rPr>
+          <w:rStyle w:val="NormalTok"/>
+        </w:rPr>
+        <w:t xml:space="preserve">(ch_exp[</w:t>
+      </w:r>
+      <w:r>
+        <w:rPr>
+          <w:rStyle w:val="OperatorTok"/>
+        </w:rPr>
+        <w:t xml:space="preserve">:</w:t>
+      </w:r>
+      <w:r>
+        <w:rPr>
+          <w:rStyle w:val="NormalTok"/>
+        </w:rPr>
+        <w:t xml:space="preserve">β]),  </w:t>
+      </w:r>
+      <w:r>
+        <w:rPr>
+          <w:rStyle w:val="FunctionTok"/>
+        </w:rPr>
+        <w:t xml:space="preserve">vec</w:t>
+      </w:r>
+      <w:r>
+        <w:rPr>
+          <w:rStyle w:val="NormalTok"/>
+        </w:rPr>
+        <w:t xml:space="preserve">(ch_exp[</w:t>
+      </w:r>
+      <w:r>
+        <w:rPr>
+          <w:rStyle w:val="OperatorTok"/>
+        </w:rPr>
+        <w:t xml:space="preserve">:</w:t>
+      </w:r>
+      <w:r>
+        <w:rPr>
+          <w:rStyle w:val="NormalTok"/>
+        </w:rPr>
+        <w:t xml:space="preserve">γ]);  R0e </w:t>
+      </w:r>
+      <w:r>
+        <w:rPr>
+          <w:rStyle w:val="OperatorTok"/>
+        </w:rPr>
+        <w:t xml:space="preserve">=</w:t>
+      </w:r>
+      <w:r>
+        <w:rPr>
+          <w:rStyle w:val="NormalTok"/>
+        </w:rPr>
+        <w:t xml:space="preserve"> βe </w:t>
+      </w:r>
+      <w:r>
+        <w:rPr>
+          <w:rStyle w:val="OperatorTok"/>
+        </w:rPr>
+        <w:t xml:space="preserve">./</w:t>
+      </w:r>
+      <w:r>
+        <w:rPr>
+          <w:rStyle w:val="NormalTok"/>
+        </w:rPr>
+        <w:t xml:space="preserve"> γe; ipe </w:t>
+      </w:r>
+      <w:r>
+        <w:rPr>
+          <w:rStyle w:val="OperatorTok"/>
+        </w:rPr>
+        <w:t xml:space="preserve">=</w:t>
+      </w:r>
+      <w:r>
+        <w:rPr>
+          <w:rStyle w:val="NormalTok"/>
+        </w:rPr>
+        <w:t xml:space="preserve"> </w:t>
+      </w:r>
+      <w:r>
+        <w:rPr>
+          <w:rStyle w:val="FloatTok"/>
+        </w:rPr>
+        <w:t xml:space="preserve">1.0</w:t>
+      </w:r>
+      <w:r>
+        <w:rPr>
+          <w:rStyle w:val="NormalTok"/>
+        </w:rPr>
+        <w:t xml:space="preserve"> </w:t>
+      </w:r>
+      <w:r>
+        <w:rPr>
+          <w:rStyle w:val="OperatorTok"/>
+        </w:rPr>
+        <w:t xml:space="preserve">./</w:t>
+      </w:r>
+      <w:r>
+        <w:rPr>
+          <w:rStyle w:val="NormalTok"/>
+        </w:rPr>
+        <w:t xml:space="preserve"> γe</w:t>
+      </w:r>
+      <w:r>
+        <w:br/>
+      </w:r>
+      <w:r>
+        <w:rPr>
+          <w:rStyle w:val="NormalTok"/>
+        </w:rPr>
+        <w:t xml:space="preserve">βr, γr </w:t>
+      </w:r>
+      <w:r>
+        <w:rPr>
+          <w:rStyle w:val="OperatorTok"/>
+        </w:rPr>
+        <w:t xml:space="preserve">=</w:t>
+      </w:r>
+      <w:r>
+        <w:rPr>
+          <w:rStyle w:val="NormalTok"/>
+        </w:rPr>
+        <w:t xml:space="preserve"> </w:t>
+      </w:r>
+      <w:r>
+        <w:rPr>
+          <w:rStyle w:val="FunctionTok"/>
+        </w:rPr>
+        <w:t xml:space="preserve">vec</w:t>
+      </w:r>
+      <w:r>
+        <w:rPr>
+          <w:rStyle w:val="NormalTok"/>
+        </w:rPr>
+        <w:t xml:space="preserve">(ch_erl[</w:t>
+      </w:r>
+      <w:r>
+        <w:rPr>
+          <w:rStyle w:val="OperatorTok"/>
+        </w:rPr>
+        <w:t xml:space="preserve">:</w:t>
+      </w:r>
+      <w:r>
+        <w:rPr>
+          <w:rStyle w:val="NormalTok"/>
+        </w:rPr>
+        <w:t xml:space="preserve">β]),  </w:t>
+      </w:r>
+      <w:r>
+        <w:rPr>
+          <w:rStyle w:val="FunctionTok"/>
+        </w:rPr>
+        <w:t xml:space="preserve">vec</w:t>
+      </w:r>
+      <w:r>
+        <w:rPr>
+          <w:rStyle w:val="NormalTok"/>
+        </w:rPr>
+        <w:t xml:space="preserve">(ch_erl[</w:t>
+      </w:r>
+      <w:r>
+        <w:rPr>
+          <w:rStyle w:val="OperatorTok"/>
+        </w:rPr>
+        <w:t xml:space="preserve">:</w:t>
+      </w:r>
+      <w:r>
+        <w:rPr>
+          <w:rStyle w:val="NormalTok"/>
+        </w:rPr>
+        <w:t xml:space="preserve">γ]);  R0r </w:t>
+      </w:r>
+      <w:r>
+        <w:rPr>
+          <w:rStyle w:val="OperatorTok"/>
+        </w:rPr>
+        <w:t xml:space="preserve">=</w:t>
+      </w:r>
+      <w:r>
+        <w:rPr>
+          <w:rStyle w:val="NormalTok"/>
+        </w:rPr>
+        <w:t xml:space="preserve"> βr </w:t>
+      </w:r>
+      <w:r>
+        <w:rPr>
+          <w:rStyle w:val="OperatorTok"/>
+        </w:rPr>
+        <w:t xml:space="preserve">./</w:t>
+      </w:r>
+      <w:r>
+        <w:rPr>
+          <w:rStyle w:val="NormalTok"/>
+        </w:rPr>
+        <w:t xml:space="preserve"> γr; ipr </w:t>
+      </w:r>
+      <w:r>
+        <w:rPr>
+          <w:rStyle w:val="OperatorTok"/>
+        </w:rPr>
+        <w:t xml:space="preserve">=</w:t>
+      </w:r>
+      <w:r>
+        <w:rPr>
+          <w:rStyle w:val="NormalTok"/>
+        </w:rPr>
+        <w:t xml:space="preserve"> </w:t>
+      </w:r>
+      <w:r>
+        <w:rPr>
+          <w:rStyle w:val="FloatTok"/>
+        </w:rPr>
+        <w:t xml:space="preserve">1.0</w:t>
+      </w:r>
+      <w:r>
+        <w:rPr>
+          <w:rStyle w:val="NormalTok"/>
+        </w:rPr>
+        <w:t xml:space="preserve"> </w:t>
+      </w:r>
+      <w:r>
+        <w:rPr>
+          <w:rStyle w:val="OperatorTok"/>
+        </w:rPr>
+        <w:t xml:space="preserve">./</w:t>
+      </w:r>
+      <w:r>
+        <w:rPr>
+          <w:rStyle w:val="NormalTok"/>
+        </w:rPr>
+        <w:t xml:space="preserve"> γr</w:t>
+      </w:r>
+      <w:r>
+        <w:br/>
+      </w:r>
+      <w:r>
+        <w:rPr>
+          <w:rStyle w:val="NormalTok"/>
+        </w:rPr>
+        <w:t xml:space="preserve">βf  </w:t>
+      </w:r>
+      <w:r>
+        <w:rPr>
+          <w:rStyle w:val="OperatorTok"/>
+        </w:rPr>
+        <w:t xml:space="preserve">=</w:t>
+      </w:r>
+      <w:r>
+        <w:rPr>
+          <w:rStyle w:val="NormalTok"/>
+        </w:rPr>
+        <w:t xml:space="preserve"> </w:t>
+      </w:r>
+      <w:r>
+        <w:rPr>
+          <w:rStyle w:val="FunctionTok"/>
+        </w:rPr>
+        <w:t xml:space="preserve">vec</w:t>
+      </w:r>
+      <w:r>
+        <w:rPr>
+          <w:rStyle w:val="NormalTok"/>
+        </w:rPr>
+        <w:t xml:space="preserve">(ch_fix[</w:t>
+      </w:r>
+      <w:r>
+        <w:rPr>
+          <w:rStyle w:val="OperatorTok"/>
+        </w:rPr>
+        <w:t xml:space="preserve">:</w:t>
+      </w:r>
+      <w:r>
+        <w:rPr>
+          <w:rStyle w:val="NormalTok"/>
+        </w:rPr>
+        <w:t xml:space="preserve">β]); R0f </w:t>
+      </w:r>
+      <w:r>
+        <w:rPr>
+          <w:rStyle w:val="OperatorTok"/>
+        </w:rPr>
+        <w:t xml:space="preserve">=</w:t>
+      </w:r>
+      <w:r>
+        <w:rPr>
+          <w:rStyle w:val="NormalTok"/>
+        </w:rPr>
+        <w:t xml:space="preserve"> βf </w:t>
+      </w:r>
+      <w:r>
+        <w:rPr>
+          <w:rStyle w:val="OperatorTok"/>
+        </w:rPr>
+        <w:t xml:space="preserve">./</w:t>
+      </w:r>
+      <w:r>
+        <w:rPr>
+          <w:rStyle w:val="NormalTok"/>
+        </w:rPr>
+        <w:t xml:space="preserve"> γ_fix</w:t>
+      </w:r>
+      <w:r>
+        <w:br/>
+      </w:r>
+      <w:r>
+        <w:rPr>
+          <w:rStyle w:val="NormalTok"/>
+        </w:rPr>
+        <w:t xml:space="preserve">βd, pr, rr </w:t>
+      </w:r>
+      <w:r>
+        <w:rPr>
+          <w:rStyle w:val="OperatorTok"/>
+        </w:rPr>
+        <w:t xml:space="preserve">=</w:t>
+      </w:r>
+      <w:r>
+        <w:rPr>
+          <w:rStyle w:val="NormalTok"/>
+        </w:rPr>
+        <w:t xml:space="preserve"> </w:t>
+      </w:r>
+      <w:r>
+        <w:rPr>
+          <w:rStyle w:val="FunctionTok"/>
+        </w:rPr>
+        <w:t xml:space="preserve">vec</w:t>
+      </w:r>
+      <w:r>
+        <w:rPr>
+          <w:rStyle w:val="NormalTok"/>
+        </w:rPr>
+        <w:t xml:space="preserve">(ch_ddsa[</w:t>
+      </w:r>
+      <w:r>
+        <w:rPr>
+          <w:rStyle w:val="OperatorTok"/>
+        </w:rPr>
+        <w:t xml:space="preserve">:</w:t>
+      </w:r>
+      <w:r>
+        <w:rPr>
+          <w:rStyle w:val="NormalTok"/>
+        </w:rPr>
+        <w:t xml:space="preserve">β]), </w:t>
+      </w:r>
+      <w:r>
+        <w:rPr>
+          <w:rStyle w:val="FunctionTok"/>
+        </w:rPr>
+        <w:t xml:space="preserve">vec</w:t>
+      </w:r>
+      <w:r>
+        <w:rPr>
+          <w:rStyle w:val="NormalTok"/>
+        </w:rPr>
+        <w:t xml:space="preserve">(ch_ddsa[</w:t>
+      </w:r>
+      <w:r>
+        <w:rPr>
+          <w:rStyle w:val="OperatorTok"/>
+        </w:rPr>
+        <w:t xml:space="preserve">:</w:t>
+      </w:r>
+      <w:r>
+        <w:rPr>
+          <w:rStyle w:val="NormalTok"/>
+        </w:rPr>
+        <w:t xml:space="preserve">nb_p]), </w:t>
+      </w:r>
+      <w:r>
+        <w:rPr>
+          <w:rStyle w:val="FunctionTok"/>
+        </w:rPr>
+        <w:t xml:space="preserve">vec</w:t>
+      </w:r>
+      <w:r>
+        <w:rPr>
+          <w:rStyle w:val="NormalTok"/>
+        </w:rPr>
+        <w:t xml:space="preserve">(ch_ddsa[</w:t>
+      </w:r>
+      <w:r>
+        <w:rPr>
+          <w:rStyle w:val="OperatorTok"/>
+        </w:rPr>
+        <w:t xml:space="preserve">:</w:t>
+      </w:r>
+      <w:r>
+        <w:rPr>
+          <w:rStyle w:val="NormalTok"/>
+        </w:rPr>
+        <w:t xml:space="preserve">nb_r])</w:t>
+      </w:r>
+      <w:r>
+        <w:br/>
+      </w:r>
+      <w:r>
+        <w:rPr>
+          <w:rStyle w:val="NormalTok"/>
+        </w:rPr>
+        <w:t xml:space="preserve">ipd </w:t>
+      </w:r>
+      <w:r>
+        <w:rPr>
+          <w:rStyle w:val="OperatorTok"/>
+        </w:rPr>
+        <w:t xml:space="preserve">=</w:t>
+      </w:r>
+      <w:r>
+        <w:rPr>
+          <w:rStyle w:val="NormalTok"/>
+        </w:rPr>
+        <w:t xml:space="preserve"> rr </w:t>
+      </w:r>
+      <w:r>
+        <w:rPr>
+          <w:rStyle w:val="OperatorTok"/>
+        </w:rPr>
+        <w:t xml:space="preserve">./</w:t>
+      </w:r>
+      <w:r>
+        <w:rPr>
+          <w:rStyle w:val="NormalTok"/>
+        </w:rPr>
+        <w:t xml:space="preserve"> pr; R0d </w:t>
+      </w:r>
+      <w:r>
+        <w:rPr>
+          <w:rStyle w:val="OperatorTok"/>
+        </w:rPr>
+        <w:t xml:space="preserve">=</w:t>
+      </w:r>
+      <w:r>
+        <w:rPr>
+          <w:rStyle w:val="NormalTok"/>
+        </w:rPr>
+        <w:t xml:space="preserve"> βd </w:t>
+      </w:r>
+      <w:r>
+        <w:rPr>
+          <w:rStyle w:val="OperatorTok"/>
+        </w:rPr>
+        <w:t xml:space="preserve">.*</w:t>
+      </w:r>
+      <w:r>
+        <w:rPr>
+          <w:rStyle w:val="NormalTok"/>
+        </w:rPr>
+        <w:t xml:space="preserve"> ipd</w:t>
+      </w:r>
+      <w:r>
+        <w:br/>
+      </w:r>
+      <w:r>
+        <w:br/>
+      </w:r>
+      <w:r>
+        <w:rPr>
+          <w:rStyle w:val="KeywordTok"/>
+        </w:rPr>
+        <w:t xml:space="preserve">function</w:t>
+      </w:r>
+      <w:r>
+        <w:rPr>
+          <w:rStyle w:val="NormalTok"/>
+        </w:rPr>
+        <w:t xml:space="preserve"> </w:t>
+      </w:r>
+      <w:r>
+        <w:rPr>
+          <w:rStyle w:val="FunctionTok"/>
+        </w:rPr>
+        <w:t xml:space="preserve">conv</w:t>
+      </w:r>
+      <w:r>
+        <w:rPr>
+          <w:rStyle w:val="NormalTok"/>
+        </w:rPr>
+        <w:t xml:space="preserve">(nm, ch)</w:t>
+      </w:r>
+      <w:r>
+        <w:br/>
+      </w:r>
+      <w:r>
+        <w:rPr>
+          <w:rStyle w:val="NormalTok"/>
+        </w:rPr>
+        <w:t xml:space="preserve">    s </w:t>
+      </w:r>
+      <w:r>
+        <w:rPr>
+          <w:rStyle w:val="OperatorTok"/>
+        </w:rPr>
+        <w:t xml:space="preserve">=</w:t>
+      </w:r>
+      <w:r>
+        <w:rPr>
+          <w:rStyle w:val="NormalTok"/>
+        </w:rPr>
+        <w:t xml:space="preserve"> </w:t>
+      </w:r>
+      <w:r>
+        <w:rPr>
+          <w:rStyle w:val="FunctionTok"/>
+        </w:rPr>
+        <w:t xml:space="preserve">DataFrame</w:t>
+      </w:r>
+      <w:r>
+        <w:rPr>
+          <w:rStyle w:val="NormalTok"/>
+        </w:rPr>
+        <w:t xml:space="preserve">(</w:t>
+      </w:r>
+      <w:r>
+        <w:rPr>
+          <w:rStyle w:val="FunctionTok"/>
+        </w:rPr>
+        <w:t xml:space="preserve">summarystats</w:t>
+      </w:r>
+      <w:r>
+        <w:rPr>
+          <w:rStyle w:val="NormalTok"/>
+        </w:rPr>
+        <w:t xml:space="preserve">(ch)); pn </w:t>
+      </w:r>
+      <w:r>
+        <w:rPr>
+          <w:rStyle w:val="OperatorTok"/>
+        </w:rPr>
+        <w:t xml:space="preserve">=</w:t>
+      </w:r>
+      <w:r>
+        <w:rPr>
+          <w:rStyle w:val="NormalTok"/>
+        </w:rPr>
+        <w:t xml:space="preserve"> </w:t>
+      </w:r>
+      <w:r>
+        <w:rPr>
+          <w:rStyle w:val="FunctionTok"/>
+        </w:rPr>
+        <w:t xml:space="preserve">propertynames</w:t>
+      </w:r>
+      <w:r>
+        <w:rPr>
+          <w:rStyle w:val="NormalTok"/>
+        </w:rPr>
+        <w:t xml:space="preserve">(s)</w:t>
+      </w:r>
+      <w:r>
+        <w:br/>
+      </w:r>
+      <w:r>
+        <w:rPr>
+          <w:rStyle w:val="NormalTok"/>
+        </w:rPr>
+        <w:t xml:space="preserve">    rh </w:t>
+      </w:r>
+      <w:r>
+        <w:rPr>
+          <w:rStyle w:val="OperatorTok"/>
+        </w:rPr>
+        <w:t xml:space="preserve">=</w:t>
+      </w:r>
+      <w:r>
+        <w:rPr>
+          <w:rStyle w:val="NormalTok"/>
+        </w:rPr>
+        <w:t xml:space="preserve"> </w:t>
+      </w:r>
+      <w:r>
+        <w:rPr>
+          <w:rStyle w:val="OperatorTok"/>
+        </w:rPr>
+        <w:t xml:space="preserve">:</w:t>
+      </w:r>
+      <w:r>
+        <w:rPr>
+          <w:rStyle w:val="NormalTok"/>
+        </w:rPr>
+        <w:t xml:space="preserve">rhat </w:t>
+      </w:r>
+      <w:r>
+        <w:rPr>
+          <w:rStyle w:val="KeywordTok"/>
+        </w:rPr>
+        <w:t xml:space="preserve">in</w:t>
+      </w:r>
+      <w:r>
+        <w:rPr>
+          <w:rStyle w:val="NormalTok"/>
+        </w:rPr>
+        <w:t xml:space="preserve"> pn ? </w:t>
+      </w:r>
+      <w:r>
+        <w:rPr>
+          <w:rStyle w:val="FunctionTok"/>
+        </w:rPr>
+        <w:t xml:space="preserve">filter</w:t>
+      </w:r>
+      <w:r>
+        <w:rPr>
+          <w:rStyle w:val="NormalTok"/>
+        </w:rPr>
+        <w:t xml:space="preserve">(isfinite, </w:t>
+      </w:r>
+      <w:r>
+        <w:rPr>
+          <w:rStyle w:val="FunctionTok"/>
+        </w:rPr>
+        <w:t xml:space="preserve">collect</w:t>
+      </w:r>
+      <w:r>
+        <w:rPr>
+          <w:rStyle w:val="NormalTok"/>
+        </w:rPr>
+        <w:t xml:space="preserve">(</w:t>
+      </w:r>
+      <w:r>
+        <w:rPr>
+          <w:rStyle w:val="FunctionTok"/>
+        </w:rPr>
+        <w:t xml:space="preserve">skipmissing</w:t>
+      </w:r>
+      <w:r>
+        <w:rPr>
+          <w:rStyle w:val="NormalTok"/>
+        </w:rPr>
+        <w:t xml:space="preserve">(s.rhat))) </w:t>
+      </w:r>
+      <w:r>
+        <w:rPr>
+          <w:rStyle w:val="OperatorTok"/>
+        </w:rPr>
+        <w:t xml:space="preserve">:</w:t>
+      </w:r>
+      <w:r>
+        <w:rPr>
+          <w:rStyle w:val="NormalTok"/>
+        </w:rPr>
+        <w:t xml:space="preserve"> </w:t>
+      </w:r>
+      <w:r>
+        <w:rPr>
+          <w:rStyle w:val="DataTypeTok"/>
+        </w:rPr>
+        <w:t xml:space="preserve">Float64</w:t>
+      </w:r>
+      <w:r>
+        <w:rPr>
+          <w:rStyle w:val="NormalTok"/>
+        </w:rPr>
+        <w:t xml:space="preserve">[]</w:t>
+      </w:r>
+      <w:r>
+        <w:br/>
+      </w:r>
+      <w:r>
+        <w:rPr>
+          <w:rStyle w:val="NormalTok"/>
+        </w:rPr>
+        <w:t xml:space="preserve">    ecraw </w:t>
+      </w:r>
+      <w:r>
+        <w:rPr>
+          <w:rStyle w:val="OperatorTok"/>
+        </w:rPr>
+        <w:t xml:space="preserve">=</w:t>
+      </w:r>
+      <w:r>
+        <w:rPr>
+          <w:rStyle w:val="NormalTok"/>
+        </w:rPr>
+        <w:t xml:space="preserve"> </w:t>
+      </w:r>
+      <w:r>
+        <w:rPr>
+          <w:rStyle w:val="OperatorTok"/>
+        </w:rPr>
+        <w:t xml:space="preserve">:</w:t>
+      </w:r>
+      <w:r>
+        <w:rPr>
+          <w:rStyle w:val="NormalTok"/>
+        </w:rPr>
+        <w:t xml:space="preserve">ess_bulk </w:t>
+      </w:r>
+      <w:r>
+        <w:rPr>
+          <w:rStyle w:val="KeywordTok"/>
+        </w:rPr>
+        <w:t xml:space="preserve">in</w:t>
+      </w:r>
+      <w:r>
+        <w:rPr>
+          <w:rStyle w:val="NormalTok"/>
+        </w:rPr>
+        <w:t xml:space="preserve"> pn ? s.ess_bulk </w:t>
+      </w:r>
+      <w:r>
+        <w:rPr>
+          <w:rStyle w:val="OperatorTok"/>
+        </w:rPr>
+        <w:t xml:space="preserve">:</w:t>
+      </w:r>
+      <w:r>
+        <w:rPr>
+          <w:rStyle w:val="NormalTok"/>
+        </w:rPr>
         <w:t xml:space="preserve"> (</w:t>
       </w:r>
       <w:r>
         <w:rPr>
+          <w:rStyle w:val="OperatorTok"/>
+        </w:rPr>
+        <w:t xml:space="preserve">:</w:t>
+      </w:r>
+      <w:r>
+        <w:rPr>
+          <w:rStyle w:val="NormalTok"/>
+        </w:rPr>
+        <w:t xml:space="preserve">ess </w:t>
+      </w:r>
+      <w:r>
+        <w:rPr>
+          <w:rStyle w:val="KeywordTok"/>
+        </w:rPr>
+        <w:t xml:space="preserve">in</w:t>
+      </w:r>
+      <w:r>
+        <w:rPr>
+          <w:rStyle w:val="NormalTok"/>
+        </w:rPr>
+        <w:t xml:space="preserve"> pn ? s.ess </w:t>
+      </w:r>
+      <w:r>
+        <w:rPr>
+          <w:rStyle w:val="OperatorTok"/>
+        </w:rPr>
+        <w:t xml:space="preserve">:</w:t>
+      </w:r>
+      <w:r>
+        <w:rPr>
+          <w:rStyle w:val="NormalTok"/>
+        </w:rPr>
+        <w:t xml:space="preserve"> </w:t>
+      </w:r>
+      <w:r>
+        <w:rPr>
+          <w:rStyle w:val="DataTypeTok"/>
+        </w:rPr>
+        <w:t xml:space="preserve">Float64</w:t>
+      </w:r>
+      <w:r>
+        <w:rPr>
+          <w:rStyle w:val="NormalTok"/>
+        </w:rPr>
+        <w:t xml:space="preserve">[])</w:t>
+      </w:r>
+      <w:r>
+        <w:br/>
+      </w:r>
+      <w:r>
+        <w:rPr>
+          <w:rStyle w:val="NormalTok"/>
+        </w:rPr>
+        <w:t xml:space="preserve">    ec </w:t>
+      </w:r>
+      <w:r>
+        <w:rPr>
+          <w:rStyle w:val="OperatorTok"/>
+        </w:rPr>
+        <w:t xml:space="preserve">=</w:t>
+      </w:r>
+      <w:r>
+        <w:rPr>
+          <w:rStyle w:val="NormalTok"/>
+        </w:rPr>
+        <w:t xml:space="preserve"> </w:t>
+      </w:r>
+      <w:r>
+        <w:rPr>
+          <w:rStyle w:val="FunctionTok"/>
+        </w:rPr>
+        <w:t xml:space="preserve">filter</w:t>
+      </w:r>
+      <w:r>
+        <w:rPr>
+          <w:rStyle w:val="NormalTok"/>
+        </w:rPr>
+        <w:t xml:space="preserve">(isfinite, </w:t>
+      </w:r>
+      <w:r>
+        <w:rPr>
+          <w:rStyle w:val="FunctionTok"/>
+        </w:rPr>
+        <w:t xml:space="preserve">collect</w:t>
+      </w:r>
+      <w:r>
+        <w:rPr>
+          <w:rStyle w:val="NormalTok"/>
+        </w:rPr>
+        <w:t xml:space="preserve">(</w:t>
+      </w:r>
+      <w:r>
+        <w:rPr>
+          <w:rStyle w:val="FunctionTok"/>
+        </w:rPr>
+        <w:t xml:space="preserve">skipmissing</w:t>
+      </w:r>
+      <w:r>
+        <w:rPr>
+          <w:rStyle w:val="NormalTok"/>
+        </w:rPr>
+        <w:t xml:space="preserve">(ecraw)))</w:t>
+      </w:r>
+      <w:r>
+        <w:br/>
+      </w:r>
+      <w:r>
+        <w:rPr>
+          <w:rStyle w:val="NormalTok"/>
+        </w:rPr>
+        <w:t xml:space="preserve">    dv </w:t>
+      </w:r>
+      <w:r>
+        <w:rPr>
+          <w:rStyle w:val="OperatorTok"/>
+        </w:rPr>
+        <w:t xml:space="preserve">=</w:t>
+      </w:r>
+      <w:r>
+        <w:rPr>
+          <w:rStyle w:val="NormalTok"/>
+        </w:rPr>
+        <w:t xml:space="preserve"> </w:t>
+      </w:r>
+      <w:r>
+        <w:rPr>
+          <w:rStyle w:val="ControlFlowTok"/>
+        </w:rPr>
+        <w:t xml:space="preserve">try</w:t>
+      </w:r>
+      <w:r>
+        <w:rPr>
+          <w:rStyle w:val="NormalTok"/>
+        </w:rPr>
+        <w:t xml:space="preserve"> </w:t>
+      </w:r>
+      <w:r>
+        <w:rPr>
+          <w:rStyle w:val="FunctionTok"/>
+        </w:rPr>
+        <w:t xml:space="preserve">Int</w:t>
+      </w:r>
+      <w:r>
+        <w:rPr>
+          <w:rStyle w:val="NormalTok"/>
+        </w:rPr>
+        <w:t xml:space="preserve">(</w:t>
+      </w:r>
+      <w:r>
+        <w:rPr>
+          <w:rStyle w:val="FunctionTok"/>
+        </w:rPr>
+        <w:t xml:space="preserve">sum</w:t>
+      </w:r>
+      <w:r>
+        <w:rPr>
+          <w:rStyle w:val="NormalTok"/>
+        </w:rPr>
+        <w:t xml:space="preserve">(ch[</w:t>
+      </w:r>
+      <w:r>
+        <w:rPr>
+          <w:rStyle w:val="OperatorTok"/>
+        </w:rPr>
+        <w:t xml:space="preserve">:</w:t>
+      </w:r>
+      <w:r>
+        <w:rPr>
+          <w:rStyle w:val="NormalTok"/>
+        </w:rPr>
+        <w:t xml:space="preserve">numerical_error])) </w:t>
+      </w:r>
+      <w:r>
+        <w:rPr>
+          <w:rStyle w:val="ControlFlowTok"/>
+        </w:rPr>
+        <w:t xml:space="preserve">catch</w:t>
+      </w:r>
+      <w:r>
+        <w:rPr>
+          <w:rStyle w:val="NormalTok"/>
+        </w:rPr>
+        <w:t xml:space="preserve">; </w:t>
+      </w:r>
+      <w:r>
+        <w:rPr>
+          <w:rStyle w:val="FloatTok"/>
+        </w:rPr>
+        <w:t xml:space="preserve">0</w:t>
+      </w:r>
+      <w:r>
+        <w:rPr>
+          <w:rStyle w:val="NormalTok"/>
+        </w:rPr>
+        <w:t xml:space="preserve"> </w:t>
+      </w:r>
+      <w:r>
+        <w:rPr>
+          <w:rStyle w:val="ControlFlowTok"/>
+        </w:rPr>
+        <w:t xml:space="preserve">end</w:t>
+      </w:r>
+      <w:r>
+        <w:br/>
+      </w:r>
+      <w:r>
+        <w:rPr>
+          <w:rStyle w:val="NormalTok"/>
+        </w:rPr>
+        <w:t xml:space="preserve">    mr </w:t>
+      </w:r>
+      <w:r>
+        <w:rPr>
+          <w:rStyle w:val="OperatorTok"/>
+        </w:rPr>
+        <w:t xml:space="preserve">=</w:t>
+      </w:r>
+      <w:r>
+        <w:rPr>
+          <w:rStyle w:val="NormalTok"/>
+        </w:rPr>
+        <w:t xml:space="preserve"> </w:t>
+      </w:r>
+      <w:r>
+        <w:rPr>
+          <w:rStyle w:val="FunctionTok"/>
+        </w:rPr>
+        <w:t xml:space="preserve">isempty</w:t>
+      </w:r>
+      <w:r>
+        <w:rPr>
+          <w:rStyle w:val="NormalTok"/>
+        </w:rPr>
+        <w:t xml:space="preserve">(rh) ? </w:t>
+      </w:r>
+      <w:r>
+        <w:rPr>
+          <w:rStyle w:val="ConstantTok"/>
+        </w:rPr>
+        <w:t xml:space="preserve">NaN</w:t>
+      </w:r>
+      <w:r>
+        <w:rPr>
+          <w:rStyle w:val="NormalTok"/>
+        </w:rPr>
+        <w:t xml:space="preserve"> </w:t>
+      </w:r>
+      <w:r>
+        <w:rPr>
+          <w:rStyle w:val="OperatorTok"/>
+        </w:rPr>
+        <w:t xml:space="preserve">:</w:t>
+      </w:r>
+      <w:r>
+        <w:rPr>
+          <w:rStyle w:val="NormalTok"/>
+        </w:rPr>
+        <w:t xml:space="preserve"> </w:t>
+      </w:r>
+      <w:r>
+        <w:rPr>
+          <w:rStyle w:val="FunctionTok"/>
+        </w:rPr>
+        <w:t xml:space="preserve">maximum</w:t>
+      </w:r>
+      <w:r>
+        <w:rPr>
+          <w:rStyle w:val="NormalTok"/>
+        </w:rPr>
+        <w:t xml:space="preserve">(rh); me </w:t>
+      </w:r>
+      <w:r>
+        <w:rPr>
+          <w:rStyle w:val="OperatorTok"/>
+        </w:rPr>
+        <w:t xml:space="preserve">=</w:t>
+      </w:r>
+      <w:r>
+        <w:rPr>
+          <w:rStyle w:val="NormalTok"/>
+        </w:rPr>
+        <w:t xml:space="preserve"> </w:t>
+      </w:r>
+      <w:r>
+        <w:rPr>
+          <w:rStyle w:val="FunctionTok"/>
+        </w:rPr>
+        <w:t xml:space="preserve">isempty</w:t>
+      </w:r>
+      <w:r>
+        <w:rPr>
+          <w:rStyle w:val="NormalTok"/>
+        </w:rPr>
+        <w:t xml:space="preserve">(ec) ? </w:t>
+      </w:r>
+      <w:r>
+        <w:rPr>
+          <w:rStyle w:val="ConstantTok"/>
+        </w:rPr>
+        <w:t xml:space="preserve">NaN</w:t>
+      </w:r>
+      <w:r>
+        <w:rPr>
+          <w:rStyle w:val="NormalTok"/>
+        </w:rPr>
+        <w:t xml:space="preserve"> </w:t>
+      </w:r>
+      <w:r>
+        <w:rPr>
+          <w:rStyle w:val="OperatorTok"/>
+        </w:rPr>
+        <w:t xml:space="preserve">:</w:t>
+      </w:r>
+      <w:r>
+        <w:rPr>
+          <w:rStyle w:val="NormalTok"/>
+        </w:rPr>
+        <w:t xml:space="preserve"> </w:t>
+      </w:r>
+      <w:r>
+        <w:rPr>
+          <w:rStyle w:val="FunctionTok"/>
+        </w:rPr>
+        <w:t xml:space="preserve">minimum</w:t>
+      </w:r>
+      <w:r>
+        <w:rPr>
+          <w:rStyle w:val="NormalTok"/>
+        </w:rPr>
+        <w:t xml:space="preserve">(ec)</w:t>
+      </w:r>
+      <w:r>
+        <w:br/>
+      </w:r>
+      <w:r>
+        <w:rPr>
+          <w:rStyle w:val="NormalTok"/>
+        </w:rPr>
+        <w:t xml:space="preserve">    ess_str </w:t>
+      </w:r>
+      <w:r>
+        <w:rPr>
+          <w:rStyle w:val="OperatorTok"/>
+        </w:rPr>
+        <w:t xml:space="preserve">=</w:t>
+      </w:r>
+      <w:r>
+        <w:rPr>
+          <w:rStyle w:val="NormalTok"/>
+        </w:rPr>
+        <w:t xml:space="preserve"> </w:t>
+      </w:r>
+      <w:r>
+        <w:rPr>
+          <w:rStyle w:val="FunctionTok"/>
+        </w:rPr>
+        <w:t xml:space="preserve">isnan</w:t>
+      </w:r>
+      <w:r>
+        <w:rPr>
+          <w:rStyle w:val="NormalTok"/>
+        </w:rPr>
+        <w:t xml:space="preserve">(me) ? </w:t>
+      </w:r>
+      <w:r>
+        <w:rPr>
+          <w:rStyle w:val="StringTok"/>
+        </w:rPr>
+        <w:t xml:space="preserve">"NaN"</w:t>
+      </w:r>
+      <w:r>
+        <w:rPr>
+          <w:rStyle w:val="NormalTok"/>
+        </w:rPr>
+        <w:t xml:space="preserve"> </w:t>
+      </w:r>
+      <w:r>
+        <w:rPr>
+          <w:rStyle w:val="OperatorTok"/>
+        </w:rPr>
+        <w:t xml:space="preserve">:</w:t>
+      </w:r>
+      <w:r>
+        <w:rPr>
+          <w:rStyle w:val="NormalTok"/>
+        </w:rPr>
+        <w:t xml:space="preserve"> </w:t>
+      </w:r>
+      <w:r>
+        <w:rPr>
+          <w:rStyle w:val="FunctionTok"/>
+        </w:rPr>
+        <w:t xml:space="preserve">string</w:t>
+      </w:r>
+      <w:r>
+        <w:rPr>
+          <w:rStyle w:val="NormalTok"/>
+        </w:rPr>
+        <w:t xml:space="preserve">(</w:t>
+      </w:r>
+      <w:r>
+        <w:rPr>
+          <w:rStyle w:val="FunctionTok"/>
+        </w:rPr>
+        <w:t xml:space="preserve">Int</w:t>
+      </w:r>
+      <w:r>
+        <w:rPr>
+          <w:rStyle w:val="NormalTok"/>
+        </w:rPr>
+        <w:t xml:space="preserve">(</w:t>
+      </w:r>
+      <w:r>
+        <w:rPr>
           <w:rStyle w:val="FunctionTok"/>
         </w:rPr>
         <w:t xml:space="preserve">round</w:t>
@@ -12417,10 +14127,487 @@
         <w:rPr>
           <w:rStyle w:val="NormalTok"/>
         </w:rPr>
+        <w:t xml:space="preserve">(me)))</w:t>
+      </w:r>
+      <w:r>
+        <w:br/>
+      </w:r>
+      <w:r>
+        <w:rPr>
+          <w:rStyle w:val="NormalTok"/>
+        </w:rPr>
+        <w:t xml:space="preserve">    </w:t>
+      </w:r>
+      <w:r>
+        <w:rPr>
+          <w:rStyle w:val="FunctionTok"/>
+        </w:rPr>
+        <w:t xml:space="preserve">println</w:t>
+      </w:r>
+      <w:r>
+        <w:rPr>
+          <w:rStyle w:val="NormalTok"/>
+        </w:rPr>
         <w:t xml:space="preserve">(</w:t>
       </w:r>
       <w:r>
         <w:rPr>
+          <w:rStyle w:val="StringTok"/>
+        </w:rPr>
+        <w:t xml:space="preserve">"  </w:t>
+      </w:r>
+      <w:r>
+        <w:rPr>
+          <w:rStyle w:val="SpecialCharTok"/>
+        </w:rPr>
+        <w:t xml:space="preserve">$</w:t>
+      </w:r>
+      <w:r>
+        <w:rPr>
+          <w:rStyle w:val="NormalTok"/>
+        </w:rPr>
+        <w:t xml:space="preserve">nm</w:t>
+      </w:r>
+      <w:r>
+        <w:rPr>
+          <w:rStyle w:val="StringTok"/>
+        </w:rPr>
+        <w:t xml:space="preserve">: max R̂=</w:t>
+      </w:r>
+      <w:r>
+        <w:rPr>
+          <w:rStyle w:val="SpecialCharTok"/>
+        </w:rPr>
+        <w:t xml:space="preserve">$</w:t>
+      </w:r>
+      <w:r>
+        <w:rPr>
+          <w:rStyle w:val="NormalTok"/>
+        </w:rPr>
+        <w:t xml:space="preserve">(</w:t>
+      </w:r>
+      <w:r>
+        <w:rPr>
+          <w:rStyle w:val="FunctionTok"/>
+        </w:rPr>
+        <w:t xml:space="preserve">round</w:t>
+      </w:r>
+      <w:r>
+        <w:rPr>
+          <w:rStyle w:val="NormalTok"/>
+        </w:rPr>
+        <w:t xml:space="preserve">(mr,digits</w:t>
+      </w:r>
+      <w:r>
+        <w:rPr>
+          <w:rStyle w:val="OperatorTok"/>
+        </w:rPr>
+        <w:t xml:space="preserve">=</w:t>
+      </w:r>
+      <w:r>
+        <w:rPr>
+          <w:rStyle w:val="FloatTok"/>
+        </w:rPr>
+        <w:t xml:space="preserve">3</w:t>
+      </w:r>
+      <w:r>
+        <w:rPr>
+          <w:rStyle w:val="NormalTok"/>
+        </w:rPr>
+        <w:t xml:space="preserve">))</w:t>
+      </w:r>
+      <w:r>
+        <w:rPr>
+          <w:rStyle w:val="StringTok"/>
+        </w:rPr>
+        <w:t xml:space="preserve">, min ESS=</w:t>
+      </w:r>
+      <w:r>
+        <w:rPr>
+          <w:rStyle w:val="SpecialCharTok"/>
+        </w:rPr>
+        <w:t xml:space="preserve">$</w:t>
+      </w:r>
+      <w:r>
+        <w:rPr>
+          <w:rStyle w:val="NormalTok"/>
+        </w:rPr>
+        <w:t xml:space="preserve">ess_str</w:t>
+      </w:r>
+      <w:r>
+        <w:rPr>
+          <w:rStyle w:val="StringTok"/>
+        </w:rPr>
+        <w:t xml:space="preserve">, divergences=</w:t>
+      </w:r>
+      <w:r>
+        <w:rPr>
+          <w:rStyle w:val="SpecialCharTok"/>
+        </w:rPr>
+        <w:t xml:space="preserve">$</w:t>
+      </w:r>
+      <w:r>
+        <w:rPr>
+          <w:rStyle w:val="NormalTok"/>
+        </w:rPr>
+        <w:t xml:space="preserve">dv</w:t>
+      </w:r>
+      <w:r>
+        <w:rPr>
+          <w:rStyle w:val="StringTok"/>
+        </w:rPr>
+        <w:t xml:space="preserve">"</w:t>
+      </w:r>
+      <w:r>
+        <w:rPr>
+          <w:rStyle w:val="NormalTok"/>
+        </w:rPr>
+        <w:t xml:space="preserve">)</w:t>
+      </w:r>
+      <w:r>
+        <w:br/>
+      </w:r>
+      <w:r>
+        <w:rPr>
+          <w:rStyle w:val="KeywordTok"/>
+        </w:rPr>
+        <w:t xml:space="preserve">end</w:t>
+      </w:r>
+      <w:r>
+        <w:br/>
+      </w:r>
+      <w:r>
+        <w:br/>
+      </w:r>
+      <w:r>
+        <w:rPr>
+          <w:rStyle w:val="KeywordTok"/>
+        </w:rPr>
+        <w:t xml:space="preserve">let</w:t>
+      </w:r>
+      <w:r>
+        <w:rPr>
+          <w:rStyle w:val="NormalTok"/>
+        </w:rPr>
+        <w:t xml:space="preserve"> βpr </w:t>
+      </w:r>
+      <w:r>
+        <w:rPr>
+          <w:rStyle w:val="OperatorTok"/>
+        </w:rPr>
+        <w:t xml:space="preserve">=</w:t>
+      </w:r>
+      <w:r>
+        <w:rPr>
+          <w:rStyle w:val="NormalTok"/>
+        </w:rPr>
+        <w:t xml:space="preserve"> </w:t>
+      </w:r>
+      <w:r>
+        <w:rPr>
+          <w:rStyle w:val="FunctionTok"/>
+        </w:rPr>
+        <w:t xml:space="preserve">rand</w:t>
+      </w:r>
+      <w:r>
+        <w:rPr>
+          <w:rStyle w:val="NormalTok"/>
+        </w:rPr>
+        <w:t xml:space="preserve">(</w:t>
+      </w:r>
+      <w:r>
+        <w:rPr>
+          <w:rStyle w:val="FunctionTok"/>
+        </w:rPr>
+        <w:t xml:space="preserve">Uniform</w:t>
+      </w:r>
+      <w:r>
+        <w:rPr>
+          <w:rStyle w:val="NormalTok"/>
+        </w:rPr>
+        <w:t xml:space="preserve">(</w:t>
+      </w:r>
+      <w:r>
+        <w:rPr>
+          <w:rStyle w:val="FloatTok"/>
+        </w:rPr>
+        <w:t xml:space="preserve">1e-4</w:t>
+      </w:r>
+      <w:r>
+        <w:rPr>
+          <w:rStyle w:val="NormalTok"/>
+        </w:rPr>
+        <w:t xml:space="preserve">, β_prior_hi), </w:t>
+      </w:r>
+      <w:r>
+        <w:rPr>
+          <w:rStyle w:val="FloatTok"/>
+        </w:rPr>
+        <w:t xml:space="preserve">200_000</w:t>
+      </w:r>
+      <w:r>
+        <w:rPr>
+          <w:rStyle w:val="NormalTok"/>
+        </w:rPr>
+        <w:t xml:space="preserve">), γpr </w:t>
+      </w:r>
+      <w:r>
+        <w:rPr>
+          <w:rStyle w:val="OperatorTok"/>
+        </w:rPr>
+        <w:t xml:space="preserve">=</w:t>
+      </w:r>
+      <w:r>
+        <w:rPr>
+          <w:rStyle w:val="NormalTok"/>
+        </w:rPr>
+        <w:t xml:space="preserve"> </w:t>
+      </w:r>
+      <w:r>
+        <w:rPr>
+          <w:rStyle w:val="FunctionTok"/>
+        </w:rPr>
+        <w:t xml:space="preserve">rand</w:t>
+      </w:r>
+      <w:r>
+        <w:rPr>
+          <w:rStyle w:val="NormalTok"/>
+        </w:rPr>
+        <w:t xml:space="preserve">(</w:t>
+      </w:r>
+      <w:r>
+        <w:rPr>
+          <w:rStyle w:val="FunctionTok"/>
+        </w:rPr>
+        <w:t xml:space="preserve">Uniform</w:t>
+      </w:r>
+      <w:r>
+        <w:rPr>
+          <w:rStyle w:val="NormalTok"/>
+        </w:rPr>
+        <w:t xml:space="preserve">(</w:t>
+      </w:r>
+      <w:r>
+        <w:rPr>
+          <w:rStyle w:val="FloatTok"/>
+        </w:rPr>
+        <w:t xml:space="preserve">0.02</w:t>
+      </w:r>
+      <w:r>
+        <w:rPr>
+          <w:rStyle w:val="NormalTok"/>
+        </w:rPr>
+        <w:t xml:space="preserve">, </w:t>
+      </w:r>
+      <w:r>
+        <w:rPr>
+          <w:rStyle w:val="FloatTok"/>
+        </w:rPr>
+        <w:t xml:space="preserve">1.0</w:t>
+      </w:r>
+      <w:r>
+        <w:rPr>
+          <w:rStyle w:val="NormalTok"/>
+        </w:rPr>
+        <w:t xml:space="preserve">), </w:t>
+      </w:r>
+      <w:r>
+        <w:rPr>
+          <w:rStyle w:val="FloatTok"/>
+        </w:rPr>
+        <w:t xml:space="preserve">200_000</w:t>
+      </w:r>
+      <w:r>
+        <w:rPr>
+          <w:rStyle w:val="NormalTok"/>
+        </w:rPr>
+        <w:t xml:space="preserve">)</w:t>
+      </w:r>
+      <w:r>
+        <w:br/>
+      </w:r>
+      <w:r>
+        <w:rPr>
+          <w:rStyle w:val="NormalTok"/>
+        </w:rPr>
+        <w:t xml:space="preserve">    </w:t>
+      </w:r>
+      <w:r>
+        <w:rPr>
+          <w:rStyle w:val="KeywordTok"/>
+        </w:rPr>
+        <w:t xml:space="preserve">global</w:t>
+      </w:r>
+      <w:r>
+        <w:rPr>
+          <w:rStyle w:val="NormalTok"/>
+        </w:rPr>
+        <w:t xml:space="preserve"> R0_prior </w:t>
+      </w:r>
+      <w:r>
+        <w:rPr>
+          <w:rStyle w:val="OperatorTok"/>
+        </w:rPr>
+        <w:t xml:space="preserve">=</w:t>
+      </w:r>
+      <w:r>
+        <w:rPr>
+          <w:rStyle w:val="NormalTok"/>
+        </w:rPr>
+        <w:t xml:space="preserve"> βpr </w:t>
+      </w:r>
+      <w:r>
+        <w:rPr>
+          <w:rStyle w:val="OperatorTok"/>
+        </w:rPr>
+        <w:t xml:space="preserve">./</w:t>
+      </w:r>
+      <w:r>
+        <w:rPr>
+          <w:rStyle w:val="NormalTok"/>
+        </w:rPr>
+        <w:t xml:space="preserve"> γpr</w:t>
+      </w:r>
+      <w:r>
+        <w:br/>
+      </w:r>
+      <w:r>
+        <w:rPr>
+          <w:rStyle w:val="NormalTok"/>
+        </w:rPr>
+        <w:t xml:space="preserve">    r0_ci </w:t>
+      </w:r>
+      <w:r>
+        <w:rPr>
+          <w:rStyle w:val="OperatorTok"/>
+        </w:rPr>
+        <w:t xml:space="preserve">=</w:t>
+      </w:r>
+      <w:r>
+        <w:rPr>
+          <w:rStyle w:val="NormalTok"/>
+        </w:rPr>
+        <w:t xml:space="preserve"> </w:t>
+      </w:r>
+      <w:r>
+        <w:rPr>
+          <w:rStyle w:val="FunctionTok"/>
+        </w:rPr>
+        <w:t xml:space="preserve">round</w:t>
+      </w:r>
+      <w:r>
+        <w:rPr>
+          <w:rStyle w:val="NormalTok"/>
+        </w:rPr>
+        <w:t xml:space="preserve">.(</w:t>
+      </w:r>
+      <w:r>
+        <w:rPr>
+          <w:rStyle w:val="FunctionTok"/>
+        </w:rPr>
+        <w:t xml:space="preserve">quantile</w:t>
+      </w:r>
+      <w:r>
+        <w:rPr>
+          <w:rStyle w:val="NormalTok"/>
+        </w:rPr>
+        <w:t xml:space="preserve">(R0_prior,[</w:t>
+      </w:r>
+      <w:r>
+        <w:rPr>
+          <w:rStyle w:val="FloatTok"/>
+        </w:rPr>
+        <w:t xml:space="preserve">0.025</w:t>
+      </w:r>
+      <w:r>
+        <w:rPr>
+          <w:rStyle w:val="NormalTok"/>
+        </w:rPr>
+        <w:t xml:space="preserve">,</w:t>
+      </w:r>
+      <w:r>
+        <w:rPr>
+          <w:rStyle w:val="FloatTok"/>
+        </w:rPr>
+        <w:t xml:space="preserve">0.975</w:t>
+      </w:r>
+      <w:r>
+        <w:rPr>
+          <w:rStyle w:val="NormalTok"/>
+        </w:rPr>
+        <w:t xml:space="preserve">]),digits</w:t>
+      </w:r>
+      <w:r>
+        <w:rPr>
+          <w:rStyle w:val="OperatorTok"/>
+        </w:rPr>
+        <w:t xml:space="preserve">=</w:t>
+      </w:r>
+      <w:r>
+        <w:rPr>
+          <w:rStyle w:val="FloatTok"/>
+        </w:rPr>
+        <w:t xml:space="preserve">2</w:t>
+      </w:r>
+      <w:r>
+        <w:rPr>
+          <w:rStyle w:val="NormalTok"/>
+        </w:rPr>
+        <w:t xml:space="preserve">)</w:t>
+      </w:r>
+      <w:r>
+        <w:br/>
+      </w:r>
+      <w:r>
+        <w:rPr>
+          <w:rStyle w:val="NormalTok"/>
+        </w:rPr>
+        <w:t xml:space="preserve">    </w:t>
+      </w:r>
+      <w:r>
+        <w:rPr>
+          <w:rStyle w:val="FunctionTok"/>
+        </w:rPr>
+        <w:t xml:space="preserve">println</w:t>
+      </w:r>
+      <w:r>
+        <w:rPr>
+          <w:rStyle w:val="NormalTok"/>
+        </w:rPr>
+        <w:t xml:space="preserve">(</w:t>
+      </w:r>
+      <w:r>
+        <w:rPr>
+          <w:rStyle w:val="StringTok"/>
+        </w:rPr>
+        <w:t xml:space="preserve">"prior R0: </w:t>
+      </w:r>
+      <w:r>
+        <w:rPr>
+          <w:rStyle w:val="SpecialCharTok"/>
+        </w:rPr>
+        <w:t xml:space="preserve">$</w:t>
+      </w:r>
+      <w:r>
+        <w:rPr>
+          <w:rStyle w:val="NormalTok"/>
+        </w:rPr>
+        <w:t xml:space="preserve">(</w:t>
+      </w:r>
+      <w:r>
+        <w:rPr>
+          <w:rStyle w:val="FunctionTok"/>
+        </w:rPr>
+        <w:t xml:space="preserve">round</w:t>
+      </w:r>
+      <w:r>
+        <w:rPr>
+          <w:rStyle w:val="NormalTok"/>
+        </w:rPr>
+        <w:t xml:space="preserve">(</w:t>
+      </w:r>
+      <w:r>
+        <w:rPr>
           <w:rStyle w:val="FunctionTok"/>
         </w:rPr>
         <w:t xml:space="preserve">median</w:t>
@@ -12429,7 +14616,7 @@
         <w:rPr>
           <w:rStyle w:val="NormalTok"/>
         </w:rPr>
-        <w:t xml:space="preserve">(v),digits</w:t>
+        <w:t xml:space="preserve">(R0_prior),digits</w:t>
       </w:r>
       <w:r>
         <w:rPr>
@@ -12441,115 +14628,7 @@
         <w:rPr>
           <w:rStyle w:val="FloatTok"/>
         </w:rPr>
-        <w:t xml:space="preserve">3</w:t>
-      </w:r>
-      <w:r>
-        <w:rPr>
-          <w:rStyle w:val="NormalTok"/>
-        </w:rPr>
-        <w:t xml:space="preserve">), </w:t>
-      </w:r>
-      <w:r>
-        <w:rPr>
-          <w:rStyle w:val="FunctionTok"/>
-        </w:rPr>
-        <w:t xml:space="preserve">round</w:t>
-      </w:r>
-      <w:r>
-        <w:rPr>
-          <w:rStyle w:val="NormalTok"/>
-        </w:rPr>
-        <w:t xml:space="preserve">(</w:t>
-      </w:r>
-      <w:r>
-        <w:rPr>
-          <w:rStyle w:val="FunctionTok"/>
-        </w:rPr>
-        <w:t xml:space="preserve">quantile</w:t>
-      </w:r>
-      <w:r>
-        <w:rPr>
-          <w:rStyle w:val="NormalTok"/>
-        </w:rPr>
-        <w:t xml:space="preserve">(v,</w:t>
-      </w:r>
-      <w:r>
-        <w:rPr>
-          <w:rStyle w:val="FloatTok"/>
-        </w:rPr>
-        <w:t xml:space="preserve">0.025</w:t>
-      </w:r>
-      <w:r>
-        <w:rPr>
-          <w:rStyle w:val="NormalTok"/>
-        </w:rPr>
-        <w:t xml:space="preserve">),digits</w:t>
-      </w:r>
-      <w:r>
-        <w:rPr>
-          <w:rStyle w:val="OperatorTok"/>
-        </w:rPr>
-        <w:t xml:space="preserve">=</w:t>
-      </w:r>
-      <w:r>
-        <w:rPr>
-          <w:rStyle w:val="FloatTok"/>
-        </w:rPr>
-        <w:t xml:space="preserve">3</w:t>
-      </w:r>
-      <w:r>
-        <w:rPr>
-          <w:rStyle w:val="NormalTok"/>
-        </w:rPr>
-        <w:t xml:space="preserve">), </w:t>
-      </w:r>
-      <w:r>
-        <w:rPr>
-          <w:rStyle w:val="FunctionTok"/>
-        </w:rPr>
-        <w:t xml:space="preserve">round</w:t>
-      </w:r>
-      <w:r>
-        <w:rPr>
-          <w:rStyle w:val="NormalTok"/>
-        </w:rPr>
-        <w:t xml:space="preserve">(</w:t>
-      </w:r>
-      <w:r>
-        <w:rPr>
-          <w:rStyle w:val="FunctionTok"/>
-        </w:rPr>
-        <w:t xml:space="preserve">quantile</w:t>
-      </w:r>
-      <w:r>
-        <w:rPr>
-          <w:rStyle w:val="NormalTok"/>
-        </w:rPr>
-        <w:t xml:space="preserve">(v,</w:t>
-      </w:r>
-      <w:r>
-        <w:rPr>
-          <w:rStyle w:val="FloatTok"/>
-        </w:rPr>
-        <w:t xml:space="preserve">0.975</w:t>
-      </w:r>
-      <w:r>
-        <w:rPr>
-          <w:rStyle w:val="NormalTok"/>
-        </w:rPr>
-        <w:t xml:space="preserve">),digits</w:t>
-      </w:r>
-      <w:r>
-        <w:rPr>
-          <w:rStyle w:val="OperatorTok"/>
-        </w:rPr>
-        <w:t xml:space="preserve">=</w:t>
-      </w:r>
-      <w:r>
-        <w:rPr>
-          <w:rStyle w:val="FloatTok"/>
-        </w:rPr>
-        <w:t xml:space="preserve">3</w:t>
+        <w:t xml:space="preserve">2</w:t>
       </w:r>
       <w:r>
         <w:rPr>
@@ -12558,1225 +14637,10 @@
         <w:t xml:space="preserve">))</w:t>
       </w:r>
       <w:r>
-        <w:br/>
-      </w:r>
-      <w:r>
-        <w:rPr>
-          <w:rStyle w:val="NormalTok"/>
-        </w:rPr>
-        <w:t xml:space="preserve">βp, γp </w:t>
-      </w:r>
-      <w:r>
-        <w:rPr>
-          <w:rStyle w:val="OperatorTok"/>
-        </w:rPr>
-        <w:t xml:space="preserve">=</w:t>
-      </w:r>
-      <w:r>
-        <w:rPr>
-          <w:rStyle w:val="NormalTok"/>
-        </w:rPr>
-        <w:t xml:space="preserve"> </w:t>
-      </w:r>
-      <w:r>
-        <w:rPr>
-          <w:rStyle w:val="FunctionTok"/>
-        </w:rPr>
-        <w:t xml:space="preserve">vec</w:t>
-      </w:r>
-      <w:r>
-        <w:rPr>
-          <w:rStyle w:val="NormalTok"/>
-        </w:rPr>
-        <w:t xml:space="preserve">(ch_pois[</w:t>
-      </w:r>
-      <w:r>
-        <w:rPr>
-          <w:rStyle w:val="OperatorTok"/>
-        </w:rPr>
-        <w:t xml:space="preserve">:</w:t>
-      </w:r>
-      <w:r>
-        <w:rPr>
-          <w:rStyle w:val="NormalTok"/>
-        </w:rPr>
-        <w:t xml:space="preserve">β]), </w:t>
-      </w:r>
-      <w:r>
-        <w:rPr>
-          <w:rStyle w:val="FunctionTok"/>
-        </w:rPr>
-        <w:t xml:space="preserve">vec</w:t>
-      </w:r>
-      <w:r>
-        <w:rPr>
-          <w:rStyle w:val="NormalTok"/>
-        </w:rPr>
-        <w:t xml:space="preserve">(ch_pois[</w:t>
-      </w:r>
-      <w:r>
-        <w:rPr>
-          <w:rStyle w:val="OperatorTok"/>
-        </w:rPr>
-        <w:t xml:space="preserve">:</w:t>
-      </w:r>
-      <w:r>
-        <w:rPr>
-          <w:rStyle w:val="NormalTok"/>
-        </w:rPr>
-        <w:t xml:space="preserve">γ]); R0p </w:t>
-      </w:r>
-      <w:r>
-        <w:rPr>
-          <w:rStyle w:val="OperatorTok"/>
-        </w:rPr>
-        <w:t xml:space="preserve">=</w:t>
-      </w:r>
-      <w:r>
-        <w:rPr>
-          <w:rStyle w:val="NormalTok"/>
-        </w:rPr>
-        <w:t xml:space="preserve"> βp </w:t>
-      </w:r>
-      <w:r>
-        <w:rPr>
-          <w:rStyle w:val="OperatorTok"/>
-        </w:rPr>
-        <w:t xml:space="preserve">./</w:t>
-      </w:r>
-      <w:r>
-        <w:rPr>
-          <w:rStyle w:val="NormalTok"/>
-        </w:rPr>
-        <w:t xml:space="preserve"> γp; ipp </w:t>
-      </w:r>
-      <w:r>
-        <w:rPr>
-          <w:rStyle w:val="OperatorTok"/>
-        </w:rPr>
-        <w:t xml:space="preserve">=</w:t>
-      </w:r>
-      <w:r>
-        <w:rPr>
-          <w:rStyle w:val="NormalTok"/>
-        </w:rPr>
-        <w:t xml:space="preserve"> </w:t>
-      </w:r>
-      <w:r>
-        <w:rPr>
-          <w:rStyle w:val="FloatTok"/>
-        </w:rPr>
-        <w:t xml:space="preserve">1.0</w:t>
-      </w:r>
-      <w:r>
-        <w:rPr>
-          <w:rStyle w:val="NormalTok"/>
-        </w:rPr>
-        <w:t xml:space="preserve"> </w:t>
-      </w:r>
-      <w:r>
-        <w:rPr>
-          <w:rStyle w:val="OperatorTok"/>
-        </w:rPr>
-        <w:t xml:space="preserve">./</w:t>
-      </w:r>
-      <w:r>
-        <w:rPr>
-          <w:rStyle w:val="NormalTok"/>
-        </w:rPr>
-        <w:t xml:space="preserve"> γp</w:t>
-      </w:r>
-      <w:r>
-        <w:br/>
-      </w:r>
-      <w:r>
-        <w:rPr>
-          <w:rStyle w:val="NormalTok"/>
-        </w:rPr>
-        <w:t xml:space="preserve">βe, γe </w:t>
-      </w:r>
-      <w:r>
-        <w:rPr>
-          <w:rStyle w:val="OperatorTok"/>
-        </w:rPr>
-        <w:t xml:space="preserve">=</w:t>
-      </w:r>
-      <w:r>
-        <w:rPr>
-          <w:rStyle w:val="NormalTok"/>
-        </w:rPr>
-        <w:t xml:space="preserve"> </w:t>
-      </w:r>
-      <w:r>
-        <w:rPr>
-          <w:rStyle w:val="FunctionTok"/>
-        </w:rPr>
-        <w:t xml:space="preserve">vec</w:t>
-      </w:r>
-      <w:r>
-        <w:rPr>
-          <w:rStyle w:val="NormalTok"/>
-        </w:rPr>
-        <w:t xml:space="preserve">(ch_exp[</w:t>
-      </w:r>
-      <w:r>
-        <w:rPr>
-          <w:rStyle w:val="OperatorTok"/>
-        </w:rPr>
-        <w:t xml:space="preserve">:</w:t>
-      </w:r>
-      <w:r>
-        <w:rPr>
-          <w:rStyle w:val="NormalTok"/>
-        </w:rPr>
-        <w:t xml:space="preserve">β]),  </w:t>
-      </w:r>
-      <w:r>
-        <w:rPr>
-          <w:rStyle w:val="FunctionTok"/>
-        </w:rPr>
-        <w:t xml:space="preserve">vec</w:t>
-      </w:r>
-      <w:r>
-        <w:rPr>
-          <w:rStyle w:val="NormalTok"/>
-        </w:rPr>
-        <w:t xml:space="preserve">(ch_exp[</w:t>
-      </w:r>
-      <w:r>
-        <w:rPr>
-          <w:rStyle w:val="OperatorTok"/>
-        </w:rPr>
-        <w:t xml:space="preserve">:</w:t>
-      </w:r>
-      <w:r>
-        <w:rPr>
-          <w:rStyle w:val="NormalTok"/>
-        </w:rPr>
-        <w:t xml:space="preserve">γ]);  R0e </w:t>
-      </w:r>
-      <w:r>
-        <w:rPr>
-          <w:rStyle w:val="OperatorTok"/>
-        </w:rPr>
-        <w:t xml:space="preserve">=</w:t>
-      </w:r>
-      <w:r>
-        <w:rPr>
-          <w:rStyle w:val="NormalTok"/>
-        </w:rPr>
-        <w:t xml:space="preserve"> βe </w:t>
-      </w:r>
-      <w:r>
-        <w:rPr>
-          <w:rStyle w:val="OperatorTok"/>
-        </w:rPr>
-        <w:t xml:space="preserve">./</w:t>
-      </w:r>
-      <w:r>
-        <w:rPr>
-          <w:rStyle w:val="NormalTok"/>
-        </w:rPr>
-        <w:t xml:space="preserve"> γe; ipe </w:t>
-      </w:r>
-      <w:r>
-        <w:rPr>
-          <w:rStyle w:val="OperatorTok"/>
-        </w:rPr>
-        <w:t xml:space="preserve">=</w:t>
-      </w:r>
-      <w:r>
-        <w:rPr>
-          <w:rStyle w:val="NormalTok"/>
-        </w:rPr>
-        <w:t xml:space="preserve"> </w:t>
-      </w:r>
-      <w:r>
-        <w:rPr>
-          <w:rStyle w:val="FloatTok"/>
-        </w:rPr>
-        <w:t xml:space="preserve">1.0</w:t>
-      </w:r>
-      <w:r>
-        <w:rPr>
-          <w:rStyle w:val="NormalTok"/>
-        </w:rPr>
-        <w:t xml:space="preserve"> </w:t>
-      </w:r>
-      <w:r>
-        <w:rPr>
-          <w:rStyle w:val="OperatorTok"/>
-        </w:rPr>
-        <w:t xml:space="preserve">./</w:t>
-      </w:r>
-      <w:r>
-        <w:rPr>
-          <w:rStyle w:val="NormalTok"/>
-        </w:rPr>
-        <w:t xml:space="preserve"> γe</w:t>
-      </w:r>
-      <w:r>
-        <w:br/>
-      </w:r>
-      <w:r>
-        <w:rPr>
-          <w:rStyle w:val="NormalTok"/>
-        </w:rPr>
-        <w:t xml:space="preserve">βr, γr </w:t>
-      </w:r>
-      <w:r>
-        <w:rPr>
-          <w:rStyle w:val="OperatorTok"/>
-        </w:rPr>
-        <w:t xml:space="preserve">=</w:t>
-      </w:r>
-      <w:r>
-        <w:rPr>
-          <w:rStyle w:val="NormalTok"/>
-        </w:rPr>
-        <w:t xml:space="preserve"> </w:t>
-      </w:r>
-      <w:r>
-        <w:rPr>
-          <w:rStyle w:val="FunctionTok"/>
-        </w:rPr>
-        <w:t xml:space="preserve">vec</w:t>
-      </w:r>
-      <w:r>
-        <w:rPr>
-          <w:rStyle w:val="NormalTok"/>
-        </w:rPr>
-        <w:t xml:space="preserve">(ch_erl[</w:t>
-      </w:r>
-      <w:r>
-        <w:rPr>
-          <w:rStyle w:val="OperatorTok"/>
-        </w:rPr>
-        <w:t xml:space="preserve">:</w:t>
-      </w:r>
-      <w:r>
-        <w:rPr>
-          <w:rStyle w:val="NormalTok"/>
-        </w:rPr>
-        <w:t xml:space="preserve">β]),  </w:t>
-      </w:r>
-      <w:r>
-        <w:rPr>
-          <w:rStyle w:val="FunctionTok"/>
-        </w:rPr>
-        <w:t xml:space="preserve">vec</w:t>
-      </w:r>
-      <w:r>
-        <w:rPr>
-          <w:rStyle w:val="NormalTok"/>
-        </w:rPr>
-        <w:t xml:space="preserve">(ch_erl[</w:t>
-      </w:r>
-      <w:r>
-        <w:rPr>
-          <w:rStyle w:val="OperatorTok"/>
-        </w:rPr>
-        <w:t xml:space="preserve">:</w:t>
-      </w:r>
-      <w:r>
-        <w:rPr>
-          <w:rStyle w:val="NormalTok"/>
-        </w:rPr>
-        <w:t xml:space="preserve">γ]);  R0r </w:t>
-      </w:r>
-      <w:r>
-        <w:rPr>
-          <w:rStyle w:val="OperatorTok"/>
-        </w:rPr>
-        <w:t xml:space="preserve">=</w:t>
-      </w:r>
-      <w:r>
-        <w:rPr>
-          <w:rStyle w:val="NormalTok"/>
-        </w:rPr>
-        <w:t xml:space="preserve"> βr </w:t>
-      </w:r>
-      <w:r>
-        <w:rPr>
-          <w:rStyle w:val="OperatorTok"/>
-        </w:rPr>
-        <w:t xml:space="preserve">./</w:t>
-      </w:r>
-      <w:r>
-        <w:rPr>
-          <w:rStyle w:val="NormalTok"/>
-        </w:rPr>
-        <w:t xml:space="preserve"> γr; ipr </w:t>
-      </w:r>
-      <w:r>
-        <w:rPr>
-          <w:rStyle w:val="OperatorTok"/>
-        </w:rPr>
-        <w:t xml:space="preserve">=</w:t>
-      </w:r>
-      <w:r>
-        <w:rPr>
-          <w:rStyle w:val="NormalTok"/>
-        </w:rPr>
-        <w:t xml:space="preserve"> </w:t>
-      </w:r>
-      <w:r>
-        <w:rPr>
-          <w:rStyle w:val="FloatTok"/>
-        </w:rPr>
-        <w:t xml:space="preserve">1.0</w:t>
-      </w:r>
-      <w:r>
-        <w:rPr>
-          <w:rStyle w:val="NormalTok"/>
-        </w:rPr>
-        <w:t xml:space="preserve"> </w:t>
-      </w:r>
-      <w:r>
-        <w:rPr>
-          <w:rStyle w:val="OperatorTok"/>
-        </w:rPr>
-        <w:t xml:space="preserve">./</w:t>
-      </w:r>
-      <w:r>
-        <w:rPr>
-          <w:rStyle w:val="NormalTok"/>
-        </w:rPr>
-        <w:t xml:space="preserve"> γr</w:t>
-      </w:r>
-      <w:r>
-        <w:br/>
-      </w:r>
-      <w:r>
-        <w:rPr>
-          <w:rStyle w:val="NormalTok"/>
-        </w:rPr>
-        <w:t xml:space="preserve">βf  </w:t>
-      </w:r>
-      <w:r>
-        <w:rPr>
-          <w:rStyle w:val="OperatorTok"/>
-        </w:rPr>
-        <w:t xml:space="preserve">=</w:t>
-      </w:r>
-      <w:r>
-        <w:rPr>
-          <w:rStyle w:val="NormalTok"/>
-        </w:rPr>
-        <w:t xml:space="preserve"> </w:t>
-      </w:r>
-      <w:r>
-        <w:rPr>
-          <w:rStyle w:val="FunctionTok"/>
-        </w:rPr>
-        <w:t xml:space="preserve">vec</w:t>
-      </w:r>
-      <w:r>
-        <w:rPr>
-          <w:rStyle w:val="NormalTok"/>
-        </w:rPr>
-        <w:t xml:space="preserve">(ch_fix[</w:t>
-      </w:r>
-      <w:r>
-        <w:rPr>
-          <w:rStyle w:val="OperatorTok"/>
-        </w:rPr>
-        <w:t xml:space="preserve">:</w:t>
-      </w:r>
-      <w:r>
-        <w:rPr>
-          <w:rStyle w:val="NormalTok"/>
-        </w:rPr>
-        <w:t xml:space="preserve">β]); R0f </w:t>
-      </w:r>
-      <w:r>
-        <w:rPr>
-          <w:rStyle w:val="OperatorTok"/>
-        </w:rPr>
-        <w:t xml:space="preserve">=</w:t>
-      </w:r>
-      <w:r>
-        <w:rPr>
-          <w:rStyle w:val="NormalTok"/>
-        </w:rPr>
-        <w:t xml:space="preserve"> βf </w:t>
-      </w:r>
-      <w:r>
-        <w:rPr>
-          <w:rStyle w:val="OperatorTok"/>
-        </w:rPr>
-        <w:t xml:space="preserve">./</w:t>
-      </w:r>
-      <w:r>
-        <w:rPr>
-          <w:rStyle w:val="NormalTok"/>
-        </w:rPr>
-        <w:t xml:space="preserve"> γ_fix   </w:t>
-      </w:r>
-      <w:r>
-        <w:rPr>
-          <w:rStyle w:val="CommentTok"/>
-        </w:rPr>
-        <w:t xml:space="preserve"># continuous R₀ = β / γ_fix = β × μ_ip</w:t>
-      </w:r>
-      <w:r>
-        <w:br/>
-      </w:r>
-      <w:r>
-        <w:rPr>
-          <w:rStyle w:val="NormalTok"/>
-        </w:rPr>
-        <w:t xml:space="preserve">βd, pr, rr </w:t>
-      </w:r>
-      <w:r>
-        <w:rPr>
-          <w:rStyle w:val="OperatorTok"/>
-        </w:rPr>
-        <w:t xml:space="preserve">=</w:t>
-      </w:r>
-      <w:r>
-        <w:rPr>
-          <w:rStyle w:val="NormalTok"/>
-        </w:rPr>
-        <w:t xml:space="preserve"> </w:t>
-      </w:r>
-      <w:r>
-        <w:rPr>
-          <w:rStyle w:val="FunctionTok"/>
-        </w:rPr>
-        <w:t xml:space="preserve">vec</w:t>
-      </w:r>
-      <w:r>
-        <w:rPr>
-          <w:rStyle w:val="NormalTok"/>
-        </w:rPr>
-        <w:t xml:space="preserve">(ch_ddsa[</w:t>
-      </w:r>
-      <w:r>
-        <w:rPr>
-          <w:rStyle w:val="OperatorTok"/>
-        </w:rPr>
-        <w:t xml:space="preserve">:</w:t>
-      </w:r>
-      <w:r>
-        <w:rPr>
-          <w:rStyle w:val="NormalTok"/>
-        </w:rPr>
-        <w:t xml:space="preserve">β]), </w:t>
-      </w:r>
-      <w:r>
-        <w:rPr>
-          <w:rStyle w:val="FunctionTok"/>
-        </w:rPr>
-        <w:t xml:space="preserve">vec</w:t>
-      </w:r>
-      <w:r>
-        <w:rPr>
-          <w:rStyle w:val="NormalTok"/>
-        </w:rPr>
-        <w:t xml:space="preserve">(ch_ddsa[</w:t>
-      </w:r>
-      <w:r>
-        <w:rPr>
-          <w:rStyle w:val="OperatorTok"/>
-        </w:rPr>
-        <w:t xml:space="preserve">:</w:t>
-      </w:r>
-      <w:r>
-        <w:rPr>
-          <w:rStyle w:val="NormalTok"/>
-        </w:rPr>
-        <w:t xml:space="preserve">nb_p]), </w:t>
-      </w:r>
-      <w:r>
-        <w:rPr>
-          <w:rStyle w:val="FunctionTok"/>
-        </w:rPr>
-        <w:t xml:space="preserve">vec</w:t>
-      </w:r>
-      <w:r>
-        <w:rPr>
-          <w:rStyle w:val="NormalTok"/>
-        </w:rPr>
-        <w:t xml:space="preserve">(ch_ddsa[</w:t>
-      </w:r>
-      <w:r>
-        <w:rPr>
-          <w:rStyle w:val="OperatorTok"/>
-        </w:rPr>
-        <w:t xml:space="preserve">:</w:t>
-      </w:r>
-      <w:r>
-        <w:rPr>
-          <w:rStyle w:val="NormalTok"/>
-        </w:rPr>
-        <w:t xml:space="preserve">nb_r])</w:t>
-      </w:r>
-      <w:r>
-        <w:br/>
-      </w:r>
-      <w:r>
-        <w:rPr>
-          <w:rStyle w:val="NormalTok"/>
-        </w:rPr>
-        <w:t xml:space="preserve">ipd </w:t>
-      </w:r>
-      <w:r>
-        <w:rPr>
-          <w:rStyle w:val="OperatorTok"/>
-        </w:rPr>
-        <w:t xml:space="preserve">=</w:t>
-      </w:r>
-      <w:r>
-        <w:rPr>
-          <w:rStyle w:val="NormalTok"/>
-        </w:rPr>
-        <w:t xml:space="preserve"> rr </w:t>
-      </w:r>
-      <w:r>
-        <w:rPr>
-          <w:rStyle w:val="OperatorTok"/>
-        </w:rPr>
-        <w:t xml:space="preserve">./</w:t>
-      </w:r>
-      <w:r>
-        <w:rPr>
-          <w:rStyle w:val="NormalTok"/>
-        </w:rPr>
-        <w:t xml:space="preserve"> pr; R0d </w:t>
-      </w:r>
-      <w:r>
-        <w:rPr>
-          <w:rStyle w:val="OperatorTok"/>
-        </w:rPr>
-        <w:t xml:space="preserve">=</w:t>
-      </w:r>
-      <w:r>
-        <w:rPr>
-          <w:rStyle w:val="NormalTok"/>
-        </w:rPr>
-        <w:t xml:space="preserve"> βd </w:t>
-      </w:r>
-      <w:r>
-        <w:rPr>
-          <w:rStyle w:val="OperatorTok"/>
-        </w:rPr>
-        <w:t xml:space="preserve">.*</w:t>
-      </w:r>
-      <w:r>
-        <w:rPr>
-          <w:rStyle w:val="NormalTok"/>
-        </w:rPr>
-        <w:t xml:space="preserve"> ipd</w:t>
-      </w:r>
-      <w:r>
-        <w:br/>
-      </w:r>
-      <w:r>
-        <w:br/>
-      </w:r>
-      <w:r>
-        <w:rPr>
-          <w:rStyle w:val="KeywordTok"/>
-        </w:rPr>
-        <w:t xml:space="preserve">function</w:t>
-      </w:r>
-      <w:r>
-        <w:rPr>
-          <w:rStyle w:val="NormalTok"/>
-        </w:rPr>
-        <w:t xml:space="preserve"> </w:t>
-      </w:r>
-      <w:r>
-        <w:rPr>
-          <w:rStyle w:val="FunctionTok"/>
-        </w:rPr>
-        <w:t xml:space="preserve">conv</w:t>
-      </w:r>
-      <w:r>
-        <w:rPr>
-          <w:rStyle w:val="NormalTok"/>
-        </w:rPr>
-        <w:t xml:space="preserve">(nm, ch)</w:t>
-      </w:r>
-      <w:r>
-        <w:br/>
-      </w:r>
-      <w:r>
-        <w:rPr>
-          <w:rStyle w:val="NormalTok"/>
-        </w:rPr>
-        <w:t xml:space="preserve">    s </w:t>
-      </w:r>
-      <w:r>
-        <w:rPr>
-          <w:rStyle w:val="OperatorTok"/>
-        </w:rPr>
-        <w:t xml:space="preserve">=</w:t>
-      </w:r>
-      <w:r>
-        <w:rPr>
-          <w:rStyle w:val="NormalTok"/>
-        </w:rPr>
-        <w:t xml:space="preserve"> </w:t>
-      </w:r>
-      <w:r>
-        <w:rPr>
-          <w:rStyle w:val="FunctionTok"/>
-        </w:rPr>
-        <w:t xml:space="preserve">DataFrame</w:t>
-      </w:r>
-      <w:r>
-        <w:rPr>
-          <w:rStyle w:val="NormalTok"/>
-        </w:rPr>
-        <w:t xml:space="preserve">(</w:t>
-      </w:r>
-      <w:r>
-        <w:rPr>
-          <w:rStyle w:val="FunctionTok"/>
-        </w:rPr>
-        <w:t xml:space="preserve">summarystats</w:t>
-      </w:r>
-      <w:r>
-        <w:rPr>
-          <w:rStyle w:val="NormalTok"/>
-        </w:rPr>
-        <w:t xml:space="preserve">(ch)); pn </w:t>
-      </w:r>
-      <w:r>
-        <w:rPr>
-          <w:rStyle w:val="OperatorTok"/>
-        </w:rPr>
-        <w:t xml:space="preserve">=</w:t>
-      </w:r>
-      <w:r>
-        <w:rPr>
-          <w:rStyle w:val="NormalTok"/>
-        </w:rPr>
-        <w:t xml:space="preserve"> </w:t>
-      </w:r>
-      <w:r>
-        <w:rPr>
-          <w:rStyle w:val="FunctionTok"/>
-        </w:rPr>
-        <w:t xml:space="preserve">propertynames</w:t>
-      </w:r>
-      <w:r>
-        <w:rPr>
-          <w:rStyle w:val="NormalTok"/>
-        </w:rPr>
-        <w:t xml:space="preserve">(s)</w:t>
-      </w:r>
-      <w:r>
-        <w:br/>
-      </w:r>
-      <w:r>
-        <w:rPr>
-          <w:rStyle w:val="NormalTok"/>
-        </w:rPr>
-        <w:t xml:space="preserve">    rh </w:t>
-      </w:r>
-      <w:r>
-        <w:rPr>
-          <w:rStyle w:val="OperatorTok"/>
-        </w:rPr>
-        <w:t xml:space="preserve">=</w:t>
-      </w:r>
-      <w:r>
-        <w:rPr>
-          <w:rStyle w:val="NormalTok"/>
-        </w:rPr>
-        <w:t xml:space="preserve"> </w:t>
-      </w:r>
-      <w:r>
-        <w:rPr>
-          <w:rStyle w:val="OperatorTok"/>
-        </w:rPr>
-        <w:t xml:space="preserve">:</w:t>
-      </w:r>
-      <w:r>
-        <w:rPr>
-          <w:rStyle w:val="NormalTok"/>
-        </w:rPr>
-        <w:t xml:space="preserve">rhat </w:t>
-      </w:r>
-      <w:r>
-        <w:rPr>
-          <w:rStyle w:val="KeywordTok"/>
-        </w:rPr>
-        <w:t xml:space="preserve">in</w:t>
-      </w:r>
-      <w:r>
-        <w:rPr>
-          <w:rStyle w:val="NormalTok"/>
-        </w:rPr>
-        <w:t xml:space="preserve"> pn ? </w:t>
-      </w:r>
-      <w:r>
-        <w:rPr>
-          <w:rStyle w:val="FunctionTok"/>
-        </w:rPr>
-        <w:t xml:space="preserve">filter</w:t>
-      </w:r>
-      <w:r>
-        <w:rPr>
-          <w:rStyle w:val="NormalTok"/>
-        </w:rPr>
-        <w:t xml:space="preserve">(isfinite, </w:t>
-      </w:r>
-      <w:r>
-        <w:rPr>
-          <w:rStyle w:val="FunctionTok"/>
-        </w:rPr>
-        <w:t xml:space="preserve">collect</w:t>
-      </w:r>
-      <w:r>
-        <w:rPr>
-          <w:rStyle w:val="NormalTok"/>
-        </w:rPr>
-        <w:t xml:space="preserve">(</w:t>
-      </w:r>
-      <w:r>
-        <w:rPr>
-          <w:rStyle w:val="FunctionTok"/>
-        </w:rPr>
-        <w:t xml:space="preserve">skipmissing</w:t>
-      </w:r>
-      <w:r>
-        <w:rPr>
-          <w:rStyle w:val="NormalTok"/>
-        </w:rPr>
-        <w:t xml:space="preserve">(s.rhat))) </w:t>
-      </w:r>
-      <w:r>
-        <w:rPr>
-          <w:rStyle w:val="OperatorTok"/>
-        </w:rPr>
-        <w:t xml:space="preserve">:</w:t>
-      </w:r>
-      <w:r>
-        <w:rPr>
-          <w:rStyle w:val="NormalTok"/>
-        </w:rPr>
-        <w:t xml:space="preserve"> </w:t>
-      </w:r>
-      <w:r>
-        <w:rPr>
-          <w:rStyle w:val="DataTypeTok"/>
-        </w:rPr>
-        <w:t xml:space="preserve">Float64</w:t>
-      </w:r>
-      <w:r>
-        <w:rPr>
-          <w:rStyle w:val="NormalTok"/>
-        </w:rPr>
-        <w:t xml:space="preserve">[]</w:t>
-      </w:r>
-      <w:r>
-        <w:br/>
-      </w:r>
-      <w:r>
-        <w:rPr>
-          <w:rStyle w:val="NormalTok"/>
-        </w:rPr>
-        <w:t xml:space="preserve">    ecraw </w:t>
-      </w:r>
-      <w:r>
-        <w:rPr>
-          <w:rStyle w:val="OperatorTok"/>
-        </w:rPr>
-        <w:t xml:space="preserve">=</w:t>
-      </w:r>
-      <w:r>
-        <w:rPr>
-          <w:rStyle w:val="NormalTok"/>
-        </w:rPr>
-        <w:t xml:space="preserve"> </w:t>
-      </w:r>
-      <w:r>
-        <w:rPr>
-          <w:rStyle w:val="OperatorTok"/>
-        </w:rPr>
-        <w:t xml:space="preserve">:</w:t>
-      </w:r>
-      <w:r>
-        <w:rPr>
-          <w:rStyle w:val="NormalTok"/>
-        </w:rPr>
-        <w:t xml:space="preserve">ess_bulk </w:t>
-      </w:r>
-      <w:r>
-        <w:rPr>
-          <w:rStyle w:val="KeywordTok"/>
-        </w:rPr>
-        <w:t xml:space="preserve">in</w:t>
-      </w:r>
-      <w:r>
-        <w:rPr>
-          <w:rStyle w:val="NormalTok"/>
-        </w:rPr>
-        <w:t xml:space="preserve"> pn ? s.ess_bulk </w:t>
-      </w:r>
-      <w:r>
-        <w:rPr>
-          <w:rStyle w:val="OperatorTok"/>
-        </w:rPr>
-        <w:t xml:space="preserve">:</w:t>
-      </w:r>
-      <w:r>
-        <w:rPr>
-          <w:rStyle w:val="NormalTok"/>
-        </w:rPr>
-        <w:t xml:space="preserve"> (</w:t>
-      </w:r>
-      <w:r>
-        <w:rPr>
-          <w:rStyle w:val="OperatorTok"/>
-        </w:rPr>
-        <w:t xml:space="preserve">:</w:t>
-      </w:r>
-      <w:r>
-        <w:rPr>
-          <w:rStyle w:val="NormalTok"/>
-        </w:rPr>
-        <w:t xml:space="preserve">ess </w:t>
-      </w:r>
-      <w:r>
-        <w:rPr>
-          <w:rStyle w:val="KeywordTok"/>
-        </w:rPr>
-        <w:t xml:space="preserve">in</w:t>
-      </w:r>
-      <w:r>
-        <w:rPr>
-          <w:rStyle w:val="NormalTok"/>
-        </w:rPr>
-        <w:t xml:space="preserve"> pn ? s.ess </w:t>
-      </w:r>
-      <w:r>
-        <w:rPr>
-          <w:rStyle w:val="OperatorTok"/>
-        </w:rPr>
-        <w:t xml:space="preserve">:</w:t>
-      </w:r>
-      <w:r>
-        <w:rPr>
-          <w:rStyle w:val="NormalTok"/>
-        </w:rPr>
-        <w:t xml:space="preserve"> </w:t>
-      </w:r>
-      <w:r>
-        <w:rPr>
-          <w:rStyle w:val="DataTypeTok"/>
-        </w:rPr>
-        <w:t xml:space="preserve">Float64</w:t>
-      </w:r>
-      <w:r>
-        <w:rPr>
-          <w:rStyle w:val="NormalTok"/>
-        </w:rPr>
-        <w:t xml:space="preserve">[])</w:t>
-      </w:r>
-      <w:r>
-        <w:br/>
-      </w:r>
-      <w:r>
-        <w:rPr>
-          <w:rStyle w:val="NormalTok"/>
-        </w:rPr>
-        <w:t xml:space="preserve">    ec </w:t>
-      </w:r>
-      <w:r>
-        <w:rPr>
-          <w:rStyle w:val="OperatorTok"/>
-        </w:rPr>
-        <w:t xml:space="preserve">=</w:t>
-      </w:r>
-      <w:r>
-        <w:rPr>
-          <w:rStyle w:val="NormalTok"/>
-        </w:rPr>
-        <w:t xml:space="preserve"> </w:t>
-      </w:r>
-      <w:r>
-        <w:rPr>
-          <w:rStyle w:val="FunctionTok"/>
-        </w:rPr>
-        <w:t xml:space="preserve">filter</w:t>
-      </w:r>
-      <w:r>
-        <w:rPr>
-          <w:rStyle w:val="NormalTok"/>
-        </w:rPr>
-        <w:t xml:space="preserve">(isfinite, </w:t>
-      </w:r>
-      <w:r>
-        <w:rPr>
-          <w:rStyle w:val="FunctionTok"/>
-        </w:rPr>
-        <w:t xml:space="preserve">collect</w:t>
-      </w:r>
-      <w:r>
-        <w:rPr>
-          <w:rStyle w:val="NormalTok"/>
-        </w:rPr>
-        <w:t xml:space="preserve">(</w:t>
-      </w:r>
-      <w:r>
-        <w:rPr>
-          <w:rStyle w:val="FunctionTok"/>
-        </w:rPr>
-        <w:t xml:space="preserve">skipmissing</w:t>
-      </w:r>
-      <w:r>
-        <w:rPr>
-          <w:rStyle w:val="NormalTok"/>
-        </w:rPr>
-        <w:t xml:space="preserve">(ecraw)))</w:t>
-      </w:r>
-      <w:r>
-        <w:br/>
-      </w:r>
-      <w:r>
-        <w:rPr>
-          <w:rStyle w:val="NormalTok"/>
-        </w:rPr>
-        <w:t xml:space="preserve">    dv </w:t>
-      </w:r>
-      <w:r>
-        <w:rPr>
-          <w:rStyle w:val="OperatorTok"/>
-        </w:rPr>
-        <w:t xml:space="preserve">=</w:t>
-      </w:r>
-      <w:r>
-        <w:rPr>
-          <w:rStyle w:val="NormalTok"/>
-        </w:rPr>
-        <w:t xml:space="preserve"> </w:t>
-      </w:r>
-      <w:r>
-        <w:rPr>
-          <w:rStyle w:val="ControlFlowTok"/>
-        </w:rPr>
-        <w:t xml:space="preserve">try</w:t>
-      </w:r>
-      <w:r>
-        <w:rPr>
-          <w:rStyle w:val="NormalTok"/>
-        </w:rPr>
-        <w:t xml:space="preserve"> </w:t>
-      </w:r>
-      <w:r>
-        <w:rPr>
-          <w:rStyle w:val="FunctionTok"/>
-        </w:rPr>
-        <w:t xml:space="preserve">sum</w:t>
-      </w:r>
-      <w:r>
-        <w:rPr>
-          <w:rStyle w:val="NormalTok"/>
-        </w:rPr>
-        <w:t xml:space="preserve">(ch[</w:t>
-      </w:r>
-      <w:r>
-        <w:rPr>
-          <w:rStyle w:val="OperatorTok"/>
-        </w:rPr>
-        <w:t xml:space="preserve">:</w:t>
-      </w:r>
-      <w:r>
-        <w:rPr>
-          <w:rStyle w:val="NormalTok"/>
-        </w:rPr>
-        <w:t xml:space="preserve">numerical_error]) </w:t>
-      </w:r>
-      <w:r>
-        <w:rPr>
-          <w:rStyle w:val="ControlFlowTok"/>
-        </w:rPr>
-        <w:t xml:space="preserve">catch</w:t>
-      </w:r>
-      <w:r>
-        <w:rPr>
-          <w:rStyle w:val="NormalTok"/>
-        </w:rPr>
-        <w:t xml:space="preserve">; </w:t>
-      </w:r>
-      <w:r>
-        <w:rPr>
-          <w:rStyle w:val="ConstantTok"/>
-        </w:rPr>
-        <w:t xml:space="preserve">missing</w:t>
-      </w:r>
-      <w:r>
-        <w:rPr>
-          <w:rStyle w:val="NormalTok"/>
-        </w:rPr>
-        <w:t xml:space="preserve"> </w:t>
-      </w:r>
-      <w:r>
-        <w:rPr>
-          <w:rStyle w:val="ControlFlowTok"/>
-        </w:rPr>
-        <w:t xml:space="preserve">end</w:t>
-      </w:r>
-      <w:r>
-        <w:br/>
-      </w:r>
-      <w:r>
-        <w:rPr>
-          <w:rStyle w:val="NormalTok"/>
-        </w:rPr>
-        <w:t xml:space="preserve">    mr </w:t>
-      </w:r>
-      <w:r>
-        <w:rPr>
-          <w:rStyle w:val="OperatorTok"/>
-        </w:rPr>
-        <w:t xml:space="preserve">=</w:t>
-      </w:r>
-      <w:r>
-        <w:rPr>
-          <w:rStyle w:val="NormalTok"/>
-        </w:rPr>
-        <w:t xml:space="preserve"> </w:t>
-      </w:r>
-      <w:r>
-        <w:rPr>
-          <w:rStyle w:val="FunctionTok"/>
-        </w:rPr>
-        <w:t xml:space="preserve">isempty</w:t>
-      </w:r>
-      <w:r>
-        <w:rPr>
-          <w:rStyle w:val="NormalTok"/>
-        </w:rPr>
-        <w:t xml:space="preserve">(rh) ? </w:t>
-      </w:r>
-      <w:r>
-        <w:rPr>
-          <w:rStyle w:val="ConstantTok"/>
-        </w:rPr>
-        <w:t xml:space="preserve">NaN</w:t>
-      </w:r>
-      <w:r>
-        <w:rPr>
-          <w:rStyle w:val="NormalTok"/>
-        </w:rPr>
-        <w:t xml:space="preserve"> </w:t>
-      </w:r>
-      <w:r>
-        <w:rPr>
-          <w:rStyle w:val="OperatorTok"/>
-        </w:rPr>
-        <w:t xml:space="preserve">:</w:t>
-      </w:r>
-      <w:r>
-        <w:rPr>
-          <w:rStyle w:val="NormalTok"/>
-        </w:rPr>
-        <w:t xml:space="preserve"> </w:t>
-      </w:r>
-      <w:r>
-        <w:rPr>
-          <w:rStyle w:val="FunctionTok"/>
-        </w:rPr>
-        <w:t xml:space="preserve">maximum</w:t>
-      </w:r>
-      <w:r>
-        <w:rPr>
-          <w:rStyle w:val="NormalTok"/>
-        </w:rPr>
-        <w:t xml:space="preserve">(rh); me </w:t>
-      </w:r>
-      <w:r>
-        <w:rPr>
-          <w:rStyle w:val="OperatorTok"/>
-        </w:rPr>
-        <w:t xml:space="preserve">=</w:t>
-      </w:r>
-      <w:r>
-        <w:rPr>
-          <w:rStyle w:val="NormalTok"/>
-        </w:rPr>
-        <w:t xml:space="preserve"> </w:t>
-      </w:r>
-      <w:r>
-        <w:rPr>
-          <w:rStyle w:val="FunctionTok"/>
-        </w:rPr>
-        <w:t xml:space="preserve">isempty</w:t>
-      </w:r>
-      <w:r>
-        <w:rPr>
-          <w:rStyle w:val="NormalTok"/>
-        </w:rPr>
-        <w:t xml:space="preserve">(ec) ? </w:t>
-      </w:r>
-      <w:r>
-        <w:rPr>
-          <w:rStyle w:val="ConstantTok"/>
-        </w:rPr>
-        <w:t xml:space="preserve">NaN</w:t>
-      </w:r>
-      <w:r>
-        <w:rPr>
-          <w:rStyle w:val="NormalTok"/>
-        </w:rPr>
-        <w:t xml:space="preserve"> </w:t>
-      </w:r>
-      <w:r>
-        <w:rPr>
-          <w:rStyle w:val="OperatorTok"/>
-        </w:rPr>
-        <w:t xml:space="preserve">:</w:t>
-      </w:r>
-      <w:r>
-        <w:rPr>
-          <w:rStyle w:val="NormalTok"/>
-        </w:rPr>
-        <w:t xml:space="preserve"> </w:t>
-      </w:r>
-      <w:r>
-        <w:rPr>
-          <w:rStyle w:val="FunctionTok"/>
-        </w:rPr>
-        <w:t xml:space="preserve">minimum</w:t>
-      </w:r>
-      <w:r>
-        <w:rPr>
-          <w:rStyle w:val="NormalTok"/>
-        </w:rPr>
-        <w:t xml:space="preserve">(ec)</w:t>
-      </w:r>
-      <w:r>
-        <w:br/>
-      </w:r>
-      <w:r>
-        <w:rPr>
-          <w:rStyle w:val="NormalTok"/>
-        </w:rPr>
-        <w:t xml:space="preserve">    </w:t>
-      </w:r>
-      <w:r>
-        <w:rPr>
-          <w:rStyle w:val="FunctionTok"/>
-        </w:rPr>
-        <w:t xml:space="preserve">println</w:t>
-      </w:r>
-      <w:r>
-        <w:rPr>
-          <w:rStyle w:val="NormalTok"/>
-        </w:rPr>
-        <w:t xml:space="preserve">(</w:t>
-      </w:r>
-      <w:r>
         <w:rPr>
           <w:rStyle w:val="StringTok"/>
         </w:rPr>
-        <w:t xml:space="preserve">"  </w:t>
+        <w:t xml:space="preserve"> [</w:t>
       </w:r>
       <w:r>
         <w:rPr>
@@ -13788,13 +14652,25 @@
         <w:rPr>
           <w:rStyle w:val="NormalTok"/>
         </w:rPr>
-        <w:t xml:space="preserve">nm</w:t>
+        <w:t xml:space="preserve">(r0_ci[</w:t>
+      </w:r>
+      <w:r>
+        <w:rPr>
+          <w:rStyle w:val="FloatTok"/>
+        </w:rPr>
+        <w:t xml:space="preserve">1</w:t>
+      </w:r>
+      <w:r>
+        <w:rPr>
+          <w:rStyle w:val="NormalTok"/>
+        </w:rPr>
+        <w:t xml:space="preserve">])</w:t>
       </w:r>
       <w:r>
         <w:rPr>
           <w:rStyle w:val="StringTok"/>
         </w:rPr>
-        <w:t xml:space="preserve">: max R̂=</w:t>
+        <w:t xml:space="preserve">, </w:t>
       </w:r>
       <w:r>
         <w:rPr>
@@ -13806,490 +14682,25 @@
         <w:rPr>
           <w:rStyle w:val="NormalTok"/>
         </w:rPr>
-        <w:t xml:space="preserve">(</w:t>
-      </w:r>
-      <w:r>
-        <w:rPr>
-          <w:rStyle w:val="FunctionTok"/>
-        </w:rPr>
-        <w:t xml:space="preserve">round</w:t>
-      </w:r>
-      <w:r>
-        <w:rPr>
-          <w:rStyle w:val="NormalTok"/>
-        </w:rPr>
-        <w:t xml:space="preserve">(mr,digits</w:t>
-      </w:r>
-      <w:r>
-        <w:rPr>
-          <w:rStyle w:val="OperatorTok"/>
-        </w:rPr>
-        <w:t xml:space="preserve">=</w:t>
-      </w:r>
-      <w:r>
-        <w:rPr>
-          <w:rStyle w:val="FloatTok"/>
-        </w:rPr>
-        <w:t xml:space="preserve">3</w:t>
-      </w:r>
-      <w:r>
-        <w:rPr>
-          <w:rStyle w:val="NormalTok"/>
-        </w:rPr>
-        <w:t xml:space="preserve">))</w:t>
+        <w:t xml:space="preserve">(r0_ci[</w:t>
+      </w:r>
+      <w:r>
+        <w:rPr>
+          <w:rStyle w:val="FloatTok"/>
+        </w:rPr>
+        <w:t xml:space="preserve">2</w:t>
+      </w:r>
+      <w:r>
+        <w:rPr>
+          <w:rStyle w:val="NormalTok"/>
+        </w:rPr>
+        <w:t xml:space="preserve">])</w:t>
       </w:r>
       <w:r>
         <w:rPr>
           <w:rStyle w:val="StringTok"/>
         </w:rPr>
-        <w:t xml:space="preserve">, min ESS=</w:t>
-      </w:r>
-      <w:r>
-        <w:rPr>
-          <w:rStyle w:val="SpecialCharTok"/>
-        </w:rPr>
-        <w:t xml:space="preserve">$</w:t>
-      </w:r>
-      <w:r>
-        <w:rPr>
-          <w:rStyle w:val="NormalTok"/>
-        </w:rPr>
-        <w:t xml:space="preserve">(</w:t>
-      </w:r>
-      <w:r>
-        <w:rPr>
-          <w:rStyle w:val="FunctionTok"/>
-        </w:rPr>
-        <w:t xml:space="preserve">round</w:t>
-      </w:r>
-      <w:r>
-        <w:rPr>
-          <w:rStyle w:val="NormalTok"/>
-        </w:rPr>
-        <w:t xml:space="preserve">(me,digits</w:t>
-      </w:r>
-      <w:r>
-        <w:rPr>
-          <w:rStyle w:val="OperatorTok"/>
-        </w:rPr>
-        <w:t xml:space="preserve">=</w:t>
-      </w:r>
-      <w:r>
-        <w:rPr>
-          <w:rStyle w:val="FloatTok"/>
-        </w:rPr>
-        <w:t xml:space="preserve">0</w:t>
-      </w:r>
-      <w:r>
-        <w:rPr>
-          <w:rStyle w:val="NormalTok"/>
-        </w:rPr>
-        <w:t xml:space="preserve">))</w:t>
-      </w:r>
-      <w:r>
-        <w:rPr>
-          <w:rStyle w:val="StringTok"/>
-        </w:rPr>
-        <w:t xml:space="preserve">, divergences=</w:t>
-      </w:r>
-      <w:r>
-        <w:rPr>
-          <w:rStyle w:val="SpecialCharTok"/>
-        </w:rPr>
-        <w:t xml:space="preserve">$</w:t>
-      </w:r>
-      <w:r>
-        <w:rPr>
-          <w:rStyle w:val="NormalTok"/>
-        </w:rPr>
-        <w:t xml:space="preserve">dv</w:t>
-      </w:r>
-      <w:r>
-        <w:rPr>
-          <w:rStyle w:val="StringTok"/>
-        </w:rPr>
-        <w:t xml:space="preserve">"</w:t>
-      </w:r>
-      <w:r>
-        <w:rPr>
-          <w:rStyle w:val="NormalTok"/>
-        </w:rPr>
-        <w:t xml:space="preserve">)</w:t>
-      </w:r>
-      <w:r>
-        <w:br/>
-      </w:r>
-      <w:r>
-        <w:rPr>
-          <w:rStyle w:val="KeywordTok"/>
-        </w:rPr>
-        <w:t xml:space="preserve">end</w:t>
-      </w:r>
-      <w:r>
-        <w:br/>
-      </w:r>
-      <w:r>
-        <w:br/>
-      </w:r>
-      <w:r>
-        <w:rPr>
-          <w:rStyle w:val="KeywordTok"/>
-        </w:rPr>
-        <w:t xml:space="preserve">let</w:t>
-      </w:r>
-      <w:r>
-        <w:rPr>
-          <w:rStyle w:val="NormalTok"/>
-        </w:rPr>
-        <w:t xml:space="preserve"> βpr </w:t>
-      </w:r>
-      <w:r>
-        <w:rPr>
-          <w:rStyle w:val="OperatorTok"/>
-        </w:rPr>
-        <w:t xml:space="preserve">=</w:t>
-      </w:r>
-      <w:r>
-        <w:rPr>
-          <w:rStyle w:val="NormalTok"/>
-        </w:rPr>
-        <w:t xml:space="preserve"> </w:t>
-      </w:r>
-      <w:r>
-        <w:rPr>
-          <w:rStyle w:val="FunctionTok"/>
-        </w:rPr>
-        <w:t xml:space="preserve">rand</w:t>
-      </w:r>
-      <w:r>
-        <w:rPr>
-          <w:rStyle w:val="NormalTok"/>
-        </w:rPr>
-        <w:t xml:space="preserve">(</w:t>
-      </w:r>
-      <w:r>
-        <w:rPr>
-          <w:rStyle w:val="FunctionTok"/>
-        </w:rPr>
-        <w:t xml:space="preserve">Uniform</w:t>
-      </w:r>
-      <w:r>
-        <w:rPr>
-          <w:rStyle w:val="NormalTok"/>
-        </w:rPr>
-        <w:t xml:space="preserve">(</w:t>
-      </w:r>
-      <w:r>
-        <w:rPr>
-          <w:rStyle w:val="FloatTok"/>
-        </w:rPr>
-        <w:t xml:space="preserve">1e-4</w:t>
-      </w:r>
-      <w:r>
-        <w:rPr>
-          <w:rStyle w:val="NormalTok"/>
-        </w:rPr>
-        <w:t xml:space="preserve">, β_prior_hi), </w:t>
-      </w:r>
-      <w:r>
-        <w:rPr>
-          <w:rStyle w:val="FloatTok"/>
-        </w:rPr>
-        <w:t xml:space="preserve">200_000</w:t>
-      </w:r>
-      <w:r>
-        <w:rPr>
-          <w:rStyle w:val="NormalTok"/>
-        </w:rPr>
-        <w:t xml:space="preserve">), γpr </w:t>
-      </w:r>
-      <w:r>
-        <w:rPr>
-          <w:rStyle w:val="OperatorTok"/>
-        </w:rPr>
-        <w:t xml:space="preserve">=</w:t>
-      </w:r>
-      <w:r>
-        <w:rPr>
-          <w:rStyle w:val="NormalTok"/>
-        </w:rPr>
-        <w:t xml:space="preserve"> </w:t>
-      </w:r>
-      <w:r>
-        <w:rPr>
-          <w:rStyle w:val="FunctionTok"/>
-        </w:rPr>
-        <w:t xml:space="preserve">rand</w:t>
-      </w:r>
-      <w:r>
-        <w:rPr>
-          <w:rStyle w:val="NormalTok"/>
-        </w:rPr>
-        <w:t xml:space="preserve">(</w:t>
-      </w:r>
-      <w:r>
-        <w:rPr>
-          <w:rStyle w:val="FunctionTok"/>
-        </w:rPr>
-        <w:t xml:space="preserve">Uniform</w:t>
-      </w:r>
-      <w:r>
-        <w:rPr>
-          <w:rStyle w:val="NormalTok"/>
-        </w:rPr>
-        <w:t xml:space="preserve">(</w:t>
-      </w:r>
-      <w:r>
-        <w:rPr>
-          <w:rStyle w:val="FloatTok"/>
-        </w:rPr>
-        <w:t xml:space="preserve">0.02</w:t>
-      </w:r>
-      <w:r>
-        <w:rPr>
-          <w:rStyle w:val="NormalTok"/>
-        </w:rPr>
-        <w:t xml:space="preserve">, </w:t>
-      </w:r>
-      <w:r>
-        <w:rPr>
-          <w:rStyle w:val="FloatTok"/>
-        </w:rPr>
-        <w:t xml:space="preserve">1.0</w:t>
-      </w:r>
-      <w:r>
-        <w:rPr>
-          <w:rStyle w:val="NormalTok"/>
-        </w:rPr>
-        <w:t xml:space="preserve">), </w:t>
-      </w:r>
-      <w:r>
-        <w:rPr>
-          <w:rStyle w:val="FloatTok"/>
-        </w:rPr>
-        <w:t xml:space="preserve">200_000</w:t>
-      </w:r>
-      <w:r>
-        <w:rPr>
-          <w:rStyle w:val="NormalTok"/>
-        </w:rPr>
-        <w:t xml:space="preserve">)</w:t>
-      </w:r>
-      <w:r>
-        <w:br/>
-      </w:r>
-      <w:r>
-        <w:rPr>
-          <w:rStyle w:val="NormalTok"/>
-        </w:rPr>
-        <w:t xml:space="preserve">    </w:t>
-      </w:r>
-      <w:r>
-        <w:rPr>
-          <w:rStyle w:val="KeywordTok"/>
-        </w:rPr>
-        <w:t xml:space="preserve">global</w:t>
-      </w:r>
-      <w:r>
-        <w:rPr>
-          <w:rStyle w:val="NormalTok"/>
-        </w:rPr>
-        <w:t xml:space="preserve"> R0_prior </w:t>
-      </w:r>
-      <w:r>
-        <w:rPr>
-          <w:rStyle w:val="OperatorTok"/>
-        </w:rPr>
-        <w:t xml:space="preserve">=</w:t>
-      </w:r>
-      <w:r>
-        <w:rPr>
-          <w:rStyle w:val="NormalTok"/>
-        </w:rPr>
-        <w:t xml:space="preserve"> βpr </w:t>
-      </w:r>
-      <w:r>
-        <w:rPr>
-          <w:rStyle w:val="OperatorTok"/>
-        </w:rPr>
-        <w:t xml:space="preserve">./</w:t>
-      </w:r>
-      <w:r>
-        <w:rPr>
-          <w:rStyle w:val="NormalTok"/>
-        </w:rPr>
-        <w:t xml:space="preserve"> γpr</w:t>
-      </w:r>
-      <w:r>
-        <w:br/>
-      </w:r>
-      <w:r>
-        <w:rPr>
-          <w:rStyle w:val="NormalTok"/>
-        </w:rPr>
-        <w:t xml:space="preserve">    </w:t>
-      </w:r>
-      <w:r>
-        <w:rPr>
-          <w:rStyle w:val="FunctionTok"/>
-        </w:rPr>
-        <w:t xml:space="preserve">println</w:t>
-      </w:r>
-      <w:r>
-        <w:rPr>
-          <w:rStyle w:val="NormalTok"/>
-        </w:rPr>
-        <w:t xml:space="preserve">(</w:t>
-      </w:r>
-      <w:r>
-        <w:rPr>
-          <w:rStyle w:val="StringTok"/>
-        </w:rPr>
-        <w:t xml:space="preserve">"prior R0: median </w:t>
-      </w:r>
-      <w:r>
-        <w:rPr>
-          <w:rStyle w:val="SpecialCharTok"/>
-        </w:rPr>
-        <w:t xml:space="preserve">$</w:t>
-      </w:r>
-      <w:r>
-        <w:rPr>
-          <w:rStyle w:val="NormalTok"/>
-        </w:rPr>
-        <w:t xml:space="preserve">(</w:t>
-      </w:r>
-      <w:r>
-        <w:rPr>
-          <w:rStyle w:val="FunctionTok"/>
-        </w:rPr>
-        <w:t xml:space="preserve">round</w:t>
-      </w:r>
-      <w:r>
-        <w:rPr>
-          <w:rStyle w:val="NormalTok"/>
-        </w:rPr>
-        <w:t xml:space="preserve">(</w:t>
-      </w:r>
-      <w:r>
-        <w:rPr>
-          <w:rStyle w:val="FunctionTok"/>
-        </w:rPr>
-        <w:t xml:space="preserve">median</w:t>
-      </w:r>
-      <w:r>
-        <w:rPr>
-          <w:rStyle w:val="NormalTok"/>
-        </w:rPr>
-        <w:t xml:space="preserve">(R0_prior),digits</w:t>
-      </w:r>
-      <w:r>
-        <w:rPr>
-          <w:rStyle w:val="OperatorTok"/>
-        </w:rPr>
-        <w:t xml:space="preserve">=</w:t>
-      </w:r>
-      <w:r>
-        <w:rPr>
-          <w:rStyle w:val="FloatTok"/>
-        </w:rPr>
-        <w:t xml:space="preserve">2</w:t>
-      </w:r>
-      <w:r>
-        <w:rPr>
-          <w:rStyle w:val="NormalTok"/>
-        </w:rPr>
-        <w:t xml:space="preserve">))</w:t>
-      </w:r>
-      <w:r>
-        <w:rPr>
-          <w:rStyle w:val="StringTok"/>
-        </w:rPr>
-        <w:t xml:space="preserve">, 95% </w:t>
-      </w:r>
-      <w:r>
-        <w:rPr>
-          <w:rStyle w:val="SpecialCharTok"/>
-        </w:rPr>
-        <w:t xml:space="preserve">$</w:t>
-      </w:r>
-      <w:r>
-        <w:rPr>
-          <w:rStyle w:val="NormalTok"/>
-        </w:rPr>
-        <w:t xml:space="preserve">(</w:t>
-      </w:r>
-      <w:r>
-        <w:rPr>
-          <w:rStyle w:val="FunctionTok"/>
-        </w:rPr>
-        <w:t xml:space="preserve">round</w:t>
-      </w:r>
-      <w:r>
-        <w:rPr>
-          <w:rStyle w:val="NormalTok"/>
-        </w:rPr>
-        <w:t xml:space="preserve">.(</w:t>
-      </w:r>
-      <w:r>
-        <w:rPr>
-          <w:rStyle w:val="FunctionTok"/>
-        </w:rPr>
-        <w:t xml:space="preserve">quantile</w:t>
-      </w:r>
-      <w:r>
-        <w:rPr>
-          <w:rStyle w:val="NormalTok"/>
-        </w:rPr>
-        <w:t xml:space="preserve">(R0_prior,[</w:t>
-      </w:r>
-      <w:r>
-        <w:rPr>
-          <w:rStyle w:val="FloatTok"/>
-        </w:rPr>
-        <w:t xml:space="preserve">0.025</w:t>
-      </w:r>
-      <w:r>
-        <w:rPr>
-          <w:rStyle w:val="NormalTok"/>
-        </w:rPr>
-        <w:t xml:space="preserve">,</w:t>
-      </w:r>
-      <w:r>
-        <w:rPr>
-          <w:rStyle w:val="FloatTok"/>
-        </w:rPr>
-        <w:t xml:space="preserve">0.975</w:t>
-      </w:r>
-      <w:r>
-        <w:rPr>
-          <w:rStyle w:val="NormalTok"/>
-        </w:rPr>
-        <w:t xml:space="preserve">]),digits</w:t>
-      </w:r>
-      <w:r>
-        <w:rPr>
-          <w:rStyle w:val="OperatorTok"/>
-        </w:rPr>
-        <w:t xml:space="preserve">=</w:t>
-      </w:r>
-      <w:r>
-        <w:rPr>
-          <w:rStyle w:val="FloatTok"/>
-        </w:rPr>
-        <w:t xml:space="preserve">2</w:t>
-      </w:r>
-      <w:r>
-        <w:rPr>
-          <w:rStyle w:val="NormalTok"/>
-        </w:rPr>
-        <w:t xml:space="preserve">))</w:t>
-      </w:r>
-      <w:r>
-        <w:rPr>
-          <w:rStyle w:val="StringTok"/>
-        </w:rPr>
-        <w:t xml:space="preserve">"</w:t>
+        <w:t xml:space="preserve">]"</w:t>
       </w:r>
       <w:r>
         <w:rPr>
@@ -14315,7 +14726,7 @@
         <w:rPr>
           <w:rStyle w:val="VerbatimChar"/>
         </w:rPr>
-        <w:t xml:space="preserve">prior R0: median 2.45, 95% [0.13, 29.63]</w:t>
+        <w:t xml:space="preserve">prior R0: 2.45 [0.13, 29.63]</w:t>
       </w:r>
     </w:p>
     <w:bookmarkEnd w:id="34"/>
@@ -14330,7 +14741,7 @@
         <w:rPr>
           <w:rStyle w:val="VerbatimChar"/>
         </w:rPr>
-        <w:t xml:space="preserve">=== Convergence ===</w:t>
+        <w:t xml:space="preserve">Convergence</w:t>
       </w:r>
       <w:r>
         <w:br/>
@@ -14339,7 +14750,7 @@
         <w:rPr>
           <w:rStyle w:val="VerbatimChar"/>
         </w:rPr>
-        <w:t xml:space="preserve">  count-exp-Pois: max R̂=1.0, min ESS=290.0, divergences=0.0</w:t>
+        <w:t xml:space="preserve">  ODE-exp Poisson (γ free): max R̂=1.0, min ESS=290, divergences=0</w:t>
       </w:r>
       <w:r>
         <w:br/>
@@ -14348,7 +14759,7 @@
         <w:rPr>
           <w:rStyle w:val="VerbatimChar"/>
         </w:rPr>
-        <w:t xml:space="preserve">  count-exp-NB: max R̂=1.007, min ESS=463.0, divergences=0.0</w:t>
+        <w:t xml:space="preserve">  ODE-exp NegBin  (γ free): max R̂=1.007, min ESS=463, divergences=0</w:t>
       </w:r>
       <w:r>
         <w:br/>
@@ -14357,7 +14768,7 @@
         <w:rPr>
           <w:rStyle w:val="VerbatimChar"/>
         </w:rPr>
-        <w:t xml:space="preserve">  count-erlang-NB: max R̂=1.005, min ESS=454.0, divergences=0.0</w:t>
+        <w:t xml:space="preserve">  ODE-erlang NB   (γ free): max R̂=1.005, min ESS=454, divergences=0</w:t>
       </w:r>
       <w:r>
         <w:br/>
@@ -14366,7 +14777,7 @@
         <w:rPr>
           <w:rStyle w:val="VerbatimChar"/>
         </w:rPr>
-        <w:t xml:space="preserve">  count-exp-fixedγ: max R̂=1.0, min ESS=783.0, divergences=0.0</w:t>
+        <w:t xml:space="preserve">  ODE-exp NB   (γ fixed): max R̂=1.0, min ESS=783, divergences=0</w:t>
       </w:r>
       <w:r>
         <w:br/>
@@ -14375,7 +14786,7 @@
         <w:rPr>
           <w:rStyle w:val="VerbatimChar"/>
         </w:rPr>
-        <w:t xml:space="preserve">  DDSA: max R̂=1.001, min ESS=383.0, divergences=missing</w:t>
+        <w:t xml:space="preserve">  DDSA                     : max R̂=1.001, min ESS=383, divergences=0</w:t>
       </w:r>
       <w:r>
         <w:br/>
@@ -14387,7 +14798,7 @@
         <w:rPr>
           <w:rStyle w:val="VerbatimChar"/>
         </w:rPr>
-        <w:t xml:space="preserve">=== Posterior Median [95% CrI] ===</w:t>
+        <w:t xml:space="preserve">Posterior median [95% CrI]</w:t>
       </w:r>
       <w:r>
         <w:br/>
@@ -14396,7 +14807,7 @@
         <w:rPr>
           <w:rStyle w:val="VerbatimChar"/>
         </w:rPr>
-        <w:t xml:space="preserve">truth: β=0.5, E[W]=6.33 d, R0_imp=3.16</w:t>
+        <w:t xml:space="preserve">truth:                    β=0.5,  E[W]=6.33 d,  R0=3.16</w:t>
       </w:r>
       <w:r>
         <w:br/>
@@ -14405,7 +14816,7 @@
         <w:rPr>
           <w:rStyle w:val="VerbatimChar"/>
         </w:rPr>
-        <w:t xml:space="preserve">ODE-exp Poisson (γ free): β=(0.483, 0.376, 0.899)  meanIP=(16.541, 2.239, 46.231)  R0=(7.695, 1.956, 19.486)</w:t>
+        <w:t xml:space="preserve">ODE-exp Poisson (γ free): β=0.483 [0.376, 0.899]  meanIP=16.541 [2.239, 46.231]  R0=7.695 [1.956, 19.486]</w:t>
       </w:r>
       <w:r>
         <w:br/>
@@ -14414,7 +14825,7 @@
         <w:rPr>
           <w:rStyle w:val="VerbatimChar"/>
         </w:rPr>
-        <w:t xml:space="preserve">ODE-exp NegBin  (γ free): β=(0.524, 0.378, 1.053)  meanIP=(12.114, 1.688, 46.63)  R0=(6.062, 1.742, 20.24)</w:t>
+        <w:t xml:space="preserve">ODE-exp NegBin  (γ free): β=0.524 [0.378, 1.053]  meanIP=12.114 [1.688, 46.63]  R0=6.062 [1.742, 20.24]</w:t>
       </w:r>
       <w:r>
         <w:br/>
@@ -14423,7 +14834,7 @@
         <w:rPr>
           <w:rStyle w:val="VerbatimChar"/>
         </w:rPr>
-        <w:t xml:space="preserve">ODE-erlang NB   (γ free): β=(0.436, 0.327, 0.654)  meanIP=(11.123, 2.853, 45.751)  R0=(4.732, 1.804, 17.894)</w:t>
+        <w:t xml:space="preserve">ODE-erlang NB   (γ free): β=0.436 [0.327, 0.654]  meanIP=11.123 [2.853, 45.751]  R0=4.732 [1.804, 17.894]</w:t>
       </w:r>
       <w:r>
         <w:br/>
@@ -14432,7 +14843,7 @@
         <w:rPr>
           <w:rStyle w:val="VerbatimChar"/>
         </w:rPr>
-        <w:t xml:space="preserve">ODE-exp NB   (γ fixed):   β=(0.686, 0.592, 0.783)  meanIP=fixed 4.0 d (assumed)  R0=(2.742, 2.369, 3.133)</w:t>
+        <w:t xml:space="preserve">ODE-exp NB   (γ fixed):   β=0.686 [0.592, 0.783]  meanIP=4.0 d (fixed)  R0=2.742 [2.369, 3.133]</w:t>
       </w:r>
       <w:r>
         <w:br/>
@@ -14441,7 +14852,7 @@
         <w:rPr>
           <w:rStyle w:val="VerbatimChar"/>
         </w:rPr>
-        <w:t xml:space="preserve">DDSA (line list):         β=(0.49, 0.431, 0.559)  meanIP=(6.379, 6.028, 6.799)  R0=(3.127, 2.746, 3.573)  r=(4.0, 4.0, 4.0)</w:t>
+        <w:t xml:space="preserve">DDSA (line list):         β=0.49 [0.431, 0.559]  meanIP=6.379 [6.028, 6.799]  R0=3.127 [2.746, 3.573]  r=4 [4, 4]</w:t>
       </w:r>
     </w:p>
     <w:bookmarkEnd w:id="35"/>

</xml_diff>